<commit_message>
Alinea el backlog con la jerarquia real del tablero
La revision del tablero mostro que Jira ya distingue cuatro niveles
(Epica, Funcion, Historia, Subtarea) y que las ocho funcionalidades web
y movil estaban tipadas como Funcion, no como Historia, sin ninguna
historia hija. El backlog v1.1 tenia entonces 12 historias y 8 funciones
sin descomponer, que es exactamente el hallazgo del profesor.

- Se reestructura el documento sobre la jerarquia real Epica > Funcion >
  Historia, citando la clave de Jira de cada nivel.
- Se corrige la numeracion de las historias, que colisionaba con la del
  tablero: FE-05 era autenticacion biometrica movil en Jira y login web
  en el documento. Las 51 historias se renumeran para colgar de la
  funcion correcta.
- Se documenta que SOL-31 esta tipada como Historia cuando deberia ser
  Funcion, igual que sus ocho hermanas.

Los totales se mantienen: 62 historias, 229 SP, 76 SP de alcance.
</commit_message>
<xml_diff>
--- a/documentos/semana-4/historias_de_usuario_v2.docx
+++ b/documentos/semana-4/historias_de_usuario_v2.docx
@@ -1,6 +1,6 @@
 
 <file path=word/document.xml><?xml version="1.0" encoding="utf-8"?>
-<w:document xmlns:w="http://schemas.openxmlformats.org/wordprocessingml/2006/main">
+<w:document xmlns:w="http://schemas.openxmlformats.org/wordprocessingml/2006/main" xmlns:r="http://schemas.openxmlformats.org/officeDocument/2006/relationships" xmlns:wp="http://schemas.openxmlformats.org/drawingml/2006/wordprocessingDrawing" xmlns:a="http://schemas.openxmlformats.org/drawingml/2006/main" xmlns:pic="http://schemas.openxmlformats.org/drawingml/2006/picture">
   <w:body>
     <w:p>
       <w:pPr>
@@ -580,7 +580,16 @@
               <w:t xml:space="preserve">62 historias</w:t>
             </w:r>
             <w:r>
-              <w:t xml:space="preserve">. Las 9 features funcionales originales eran, en realidad, features de alto nivel; cada una se partió en historias de usuario verificables de forma independiente. Se identificó además una funcionalidad ausente del backlog (autenticación web) y se agregó como épica propia.</w:t>
+              <w:t xml:space="preserve">. Al revisar el tablero se confirmó el origen del problema: ocho de las veinte estaban tipadas en Jira como </w:t>
+            </w:r>
+            <w:r>
+              <w:rPr>
+                <w:b/>
+              </w:rPr>
+              <w:t xml:space="preserve">Función</w:t>
+            </w:r>
+            <w:r>
+              <w:t xml:space="preserve">, no como Historia, y ninguna tenía historias hijas. Es decir, el backlog v1.1 tenía en realidad 12 historias y 8 funciones sin descomponer. Cada función se partió en historias verificables de forma independiente. Se identificó además una funcionalidad ausente del backlog —la autenticación web— y se agregó como épica y función propias.</w:t>
             </w:r>
           </w:p>
         </w:tc>
@@ -2049,7 +2058,35 @@
         <w:pStyle w:val="Heading3"/>
       </w:pPr>
       <w:r>
-        <w:t xml:space="preserve">3.1 Épicas</w:t>
+        <w:t xml:space="preserve">3.1 Estructura jerárquica del backlog</w:t>
+      </w:r>
+    </w:p>
+    <w:p>
+      <w:r>
+        <w:t xml:space="preserve">El tablero del proyecto usa cuatro niveles de jerarquía: </w:t>
+      </w:r>
+      <w:r>
+        <w:rPr>
+          <w:b/>
+        </w:rPr>
+        <w:t xml:space="preserve">Épica → Función → Historia → Subtarea</w:t>
+      </w:r>
+      <w:r>
+        <w:t xml:space="preserve">. La revisión del tablero durante esta corrección reveló el origen preciso del hallazgo: las ocho funcionalidades web y móvil que se presentaron como historias de usuario en la semana 3 están tipadas en Jira como </w:t>
+      </w:r>
+      <w:r>
+        <w:rPr>
+          <w:b/>
+        </w:rPr>
+        <w:t xml:space="preserve">Función</w:t>
+      </w:r>
+      <w:r>
+        <w:t xml:space="preserve">, no como Historia, y ninguna tenía historias hijas. El backlog v1.1 contenía en realidad 12 historias y 8 funciones sin descomponer.</w:t>
+      </w:r>
+    </w:p>
+    <w:p>
+      <w:r>
+        <w:t xml:space="preserve">La corrección consiste en poblar el nivel que faltaba: 51 historias nuevas bajo las funciones existentes.</w:t>
       </w:r>
     </w:p>
     <w:tbl>
@@ -2099,24 +2136,7 @@
               <w:rPr>
                 <w:b/>
               </w:rPr>
-              <w:t xml:space="preserve">Nombre</w:t>
-            </w:r>
-          </w:p>
-        </w:tc>
-        <w:tc>
-          <w:tcPr>
-            <w:tcW w:w="0" w:type="auto"/>
-            <w:shd w:val="clear" w:fill="EDF2F7"/>
-          </w:tcPr>
-          <w:p>
-            <w:pPr>
-              <w:spacing w:before="20" w:after="20"/>
-            </w:pPr>
-            <w:r>
-              <w:rPr>
-                <w:b/>
-              </w:rPr>
-              <w:t xml:space="preserve">Canal</w:t>
+              <w:t xml:space="preserve">Función</w:t>
             </w:r>
           </w:p>
         </w:tc>
@@ -2165,59 +2185,52 @@
               <w:spacing w:before="20" w:after="20"/>
             </w:pPr>
             <w:r>
+              <w:rPr>
+                <w:b/>
+              </w:rPr>
               <w:t xml:space="preserve">EP-01</w:t>
             </w:r>
-          </w:p>
-        </w:tc>
-        <w:tc>
-          <w:tcPr>
-            <w:tcW w:w="0" w:type="auto"/>
-          </w:tcPr>
-          <w:p>
-            <w:pPr>
-              <w:spacing w:before="20" w:after="20"/>
-            </w:pPr>
-            <w:r>
-              <w:t xml:space="preserve">Venta asistida (cotización, suscripción y emisión)</w:t>
-            </w:r>
-          </w:p>
-        </w:tc>
-        <w:tc>
-          <w:tcPr>
-            <w:tcW w:w="0" w:type="auto"/>
-          </w:tcPr>
-          <w:p>
-            <w:pPr>
-              <w:spacing w:before="20" w:after="20"/>
-            </w:pPr>
-            <w:r>
-              <w:t xml:space="preserve">Web</w:t>
-            </w:r>
-          </w:p>
-        </w:tc>
-        <w:tc>
-          <w:tcPr>
-            <w:tcW w:w="0" w:type="auto"/>
-          </w:tcPr>
-          <w:p>
-            <w:pPr>
-              <w:spacing w:before="20" w:after="20"/>
-            </w:pPr>
-            <w:r>
-              <w:t xml:space="preserve">12</w:t>
-            </w:r>
-          </w:p>
-        </w:tc>
-        <w:tc>
-          <w:tcPr>
-            <w:tcW w:w="0" w:type="auto"/>
-          </w:tcPr>
-          <w:p>
-            <w:pPr>
-              <w:spacing w:before="20" w:after="20"/>
-            </w:pPr>
-            <w:r>
-              <w:t xml:space="preserve">31</w:t>
+            <w:r>
+              <w:t xml:space="preserve"> Gestión de seguros Web (SOL-1)</w:t>
+            </w:r>
+          </w:p>
+        </w:tc>
+        <w:tc>
+          <w:tcPr>
+            <w:tcW w:w="0" w:type="auto"/>
+          </w:tcPr>
+          <w:p>
+            <w:pPr>
+              <w:spacing w:before="20" w:after="20"/>
+            </w:pPr>
+            <w:r>
+              <w:t xml:space="preserve">FE-01 Cotización de seguros (SOL-3)</w:t>
+            </w:r>
+          </w:p>
+        </w:tc>
+        <w:tc>
+          <w:tcPr>
+            <w:tcW w:w="0" w:type="auto"/>
+          </w:tcPr>
+          <w:p>
+            <w:pPr>
+              <w:spacing w:before="20" w:after="20"/>
+            </w:pPr>
+            <w:r>
+              <w:t xml:space="preserve">FE-01.1 a FE-01.6</w:t>
+            </w:r>
+          </w:p>
+        </w:tc>
+        <w:tc>
+          <w:tcPr>
+            <w:tcW w:w="0" w:type="auto"/>
+          </w:tcPr>
+          <w:p>
+            <w:pPr>
+              <w:spacing w:before="20" w:after="20"/>
+            </w:pPr>
+            <w:r>
+              <w:t xml:space="preserve">15</w:t>
             </w:r>
           </w:p>
         </w:tc>
@@ -2232,59 +2245,46 @@
               <w:spacing w:before="20" w:after="20"/>
             </w:pPr>
             <w:r>
-              <w:t xml:space="preserve">EP-02</w:t>
-            </w:r>
-          </w:p>
-        </w:tc>
-        <w:tc>
-          <w:tcPr>
-            <w:tcW w:w="0" w:type="auto"/>
-          </w:tcPr>
-          <w:p>
-            <w:pPr>
-              <w:spacing w:before="20" w:after="20"/>
-            </w:pPr>
-            <w:r>
-              <w:t xml:space="preserve">Administración y operación de pólizas</w:t>
-            </w:r>
-          </w:p>
-        </w:tc>
-        <w:tc>
-          <w:tcPr>
-            <w:tcW w:w="0" w:type="auto"/>
-          </w:tcPr>
-          <w:p>
-            <w:pPr>
-              <w:spacing w:before="20" w:after="20"/>
-            </w:pPr>
-            <w:r>
-              <w:t xml:space="preserve">Web</w:t>
-            </w:r>
-          </w:p>
-        </w:tc>
-        <w:tc>
-          <w:tcPr>
-            <w:tcW w:w="0" w:type="auto"/>
-          </w:tcPr>
-          <w:p>
-            <w:pPr>
-              <w:spacing w:before="20" w:after="20"/>
-            </w:pPr>
-            <w:r>
-              <w:t xml:space="preserve">10</w:t>
-            </w:r>
-          </w:p>
-        </w:tc>
-        <w:tc>
-          <w:tcPr>
-            <w:tcW w:w="0" w:type="auto"/>
-          </w:tcPr>
-          <w:p>
-            <w:pPr>
-              <w:spacing w:before="20" w:after="20"/>
-            </w:pPr>
-            <w:r>
-              <w:t xml:space="preserve">28</w:t>
+              <w:t/>
+            </w:r>
+          </w:p>
+        </w:tc>
+        <w:tc>
+          <w:tcPr>
+            <w:tcW w:w="0" w:type="auto"/>
+          </w:tcPr>
+          <w:p>
+            <w:pPr>
+              <w:spacing w:before="20" w:after="20"/>
+            </w:pPr>
+            <w:r>
+              <w:t xml:space="preserve">FE-02 Suscripción y emisión (SOL-4)</w:t>
+            </w:r>
+          </w:p>
+        </w:tc>
+        <w:tc>
+          <w:tcPr>
+            <w:tcW w:w="0" w:type="auto"/>
+          </w:tcPr>
+          <w:p>
+            <w:pPr>
+              <w:spacing w:before="20" w:after="20"/>
+            </w:pPr>
+            <w:r>
+              <w:t xml:space="preserve">FE-02.1 a FE-02.6</w:t>
+            </w:r>
+          </w:p>
+        </w:tc>
+        <w:tc>
+          <w:tcPr>
+            <w:tcW w:w="0" w:type="auto"/>
+          </w:tcPr>
+          <w:p>
+            <w:pPr>
+              <w:spacing w:before="20" w:after="20"/>
+            </w:pPr>
+            <w:r>
+              <w:t xml:space="preserve">16</w:t>
             </w:r>
           </w:p>
         </w:tc>
@@ -2299,59 +2299,46 @@
               <w:spacing w:before="20" w:after="20"/>
             </w:pPr>
             <w:r>
-              <w:t xml:space="preserve">EP-03</w:t>
-            </w:r>
-          </w:p>
-        </w:tc>
-        <w:tc>
-          <w:tcPr>
-            <w:tcW w:w="0" w:type="auto"/>
-          </w:tcPr>
-          <w:p>
-            <w:pPr>
-              <w:spacing w:before="20" w:after="20"/>
-            </w:pPr>
-            <w:r>
-              <w:t xml:space="preserve">Acceso y autenticación web</w:t>
-            </w:r>
-          </w:p>
-        </w:tc>
-        <w:tc>
-          <w:tcPr>
-            <w:tcW w:w="0" w:type="auto"/>
-          </w:tcPr>
-          <w:p>
-            <w:pPr>
-              <w:spacing w:before="20" w:after="20"/>
-            </w:pPr>
-            <w:r>
-              <w:t xml:space="preserve">Web</w:t>
-            </w:r>
-          </w:p>
-        </w:tc>
-        <w:tc>
-          <w:tcPr>
-            <w:tcW w:w="0" w:type="auto"/>
-          </w:tcPr>
-          <w:p>
-            <w:pPr>
-              <w:spacing w:before="20" w:after="20"/>
-            </w:pPr>
-            <w:r>
-              <w:t xml:space="preserve">4</w:t>
-            </w:r>
-          </w:p>
-        </w:tc>
-        <w:tc>
-          <w:tcPr>
-            <w:tcW w:w="0" w:type="auto"/>
-          </w:tcPr>
-          <w:p>
-            <w:pPr>
-              <w:spacing w:before="20" w:after="20"/>
-            </w:pPr>
-            <w:r>
-              <w:t xml:space="preserve">9</w:t>
+              <w:t/>
+            </w:r>
+          </w:p>
+        </w:tc>
+        <w:tc>
+          <w:tcPr>
+            <w:tcW w:w="0" w:type="auto"/>
+          </w:tcPr>
+          <w:p>
+            <w:pPr>
+              <w:spacing w:before="20" w:after="20"/>
+            </w:pPr>
+            <w:r>
+              <w:t xml:space="preserve">FE-03 Administración de pólizas (SOL-5)</w:t>
+            </w:r>
+          </w:p>
+        </w:tc>
+        <w:tc>
+          <w:tcPr>
+            <w:tcW w:w="0" w:type="auto"/>
+          </w:tcPr>
+          <w:p>
+            <w:pPr>
+              <w:spacing w:before="20" w:after="20"/>
+            </w:pPr>
+            <w:r>
+              <w:t xml:space="preserve">FE-03.1 a FE-03.5</w:t>
+            </w:r>
+          </w:p>
+        </w:tc>
+        <w:tc>
+          <w:tcPr>
+            <w:tcW w:w="0" w:type="auto"/>
+          </w:tcPr>
+          <w:p>
+            <w:pPr>
+              <w:spacing w:before="20" w:after="20"/>
+            </w:pPr>
+            <w:r>
+              <w:t xml:space="preserve">13</w:t>
             </w:r>
           </w:p>
         </w:tc>
@@ -2366,59 +2353,52 @@
               <w:spacing w:before="20" w:after="20"/>
             </w:pPr>
             <w:r>
-              <w:t xml:space="preserve">EP-04</w:t>
-            </w:r>
-          </w:p>
-        </w:tc>
-        <w:tc>
-          <w:tcPr>
-            <w:tcW w:w="0" w:type="auto"/>
-          </w:tcPr>
-          <w:p>
-            <w:pPr>
-              <w:spacing w:before="20" w:after="20"/>
-            </w:pPr>
-            <w:r>
-              <w:t xml:space="preserve">Identidad y acceso móvil (KYC biométrico)</w:t>
-            </w:r>
-          </w:p>
-        </w:tc>
-        <w:tc>
-          <w:tcPr>
-            <w:tcW w:w="0" w:type="auto"/>
-          </w:tcPr>
-          <w:p>
-            <w:pPr>
-              <w:spacing w:before="20" w:after="20"/>
-            </w:pPr>
-            <w:r>
-              <w:t xml:space="preserve">Móvil</w:t>
-            </w:r>
-          </w:p>
-        </w:tc>
-        <w:tc>
-          <w:tcPr>
-            <w:tcW w:w="0" w:type="auto"/>
-          </w:tcPr>
-          <w:p>
-            <w:pPr>
-              <w:spacing w:before="20" w:after="20"/>
-            </w:pPr>
-            <w:r>
-              <w:t xml:space="preserve">6</w:t>
-            </w:r>
-          </w:p>
-        </w:tc>
-        <w:tc>
-          <w:tcPr>
-            <w:tcW w:w="0" w:type="auto"/>
-          </w:tcPr>
-          <w:p>
-            <w:pPr>
-              <w:spacing w:before="20" w:after="20"/>
-            </w:pPr>
-            <w:r>
-              <w:t xml:space="preserve">19</w:t>
+              <w:rPr>
+                <w:b/>
+              </w:rPr>
+              <w:t xml:space="preserve">EP-02</w:t>
+            </w:r>
+            <w:r>
+              <w:t xml:space="preserve"> Gestión de siniestros Web (SOL-2)</w:t>
+            </w:r>
+          </w:p>
+        </w:tc>
+        <w:tc>
+          <w:tcPr>
+            <w:tcW w:w="0" w:type="auto"/>
+          </w:tcPr>
+          <w:p>
+            <w:pPr>
+              <w:spacing w:before="20" w:after="20"/>
+            </w:pPr>
+            <w:r>
+              <w:t xml:space="preserve">FE-04 Gestión y seguimiento de siniestros (SOL-6)</w:t>
+            </w:r>
+          </w:p>
+        </w:tc>
+        <w:tc>
+          <w:tcPr>
+            <w:tcW w:w="0" w:type="auto"/>
+          </w:tcPr>
+          <w:p>
+            <w:pPr>
+              <w:spacing w:before="20" w:after="20"/>
+            </w:pPr>
+            <w:r>
+              <w:t xml:space="preserve">FE-04.1 a FE-04.5</w:t>
+            </w:r>
+          </w:p>
+        </w:tc>
+        <w:tc>
+          <w:tcPr>
+            <w:tcW w:w="0" w:type="auto"/>
+          </w:tcPr>
+          <w:p>
+            <w:pPr>
+              <w:spacing w:before="20" w:after="20"/>
+            </w:pPr>
+            <w:r>
+              <w:t xml:space="preserve">15</w:t>
             </w:r>
           </w:p>
         </w:tc>
@@ -2433,59 +2413,52 @@
               <w:spacing w:before="20" w:after="20"/>
             </w:pPr>
             <w:r>
-              <w:t xml:space="preserve">EP-05</w:t>
-            </w:r>
-          </w:p>
-        </w:tc>
-        <w:tc>
-          <w:tcPr>
-            <w:tcW w:w="0" w:type="auto"/>
-          </w:tcPr>
-          <w:p>
-            <w:pPr>
-              <w:spacing w:before="20" w:after="20"/>
-            </w:pPr>
-            <w:r>
-              <w:t xml:space="preserve">Autogestión móvil</w:t>
-            </w:r>
-          </w:p>
-        </w:tc>
-        <w:tc>
-          <w:tcPr>
-            <w:tcW w:w="0" w:type="auto"/>
-          </w:tcPr>
-          <w:p>
-            <w:pPr>
-              <w:spacing w:before="20" w:after="20"/>
-            </w:pPr>
-            <w:r>
-              <w:t xml:space="preserve">Móvil</w:t>
-            </w:r>
-          </w:p>
-        </w:tc>
-        <w:tc>
-          <w:tcPr>
-            <w:tcW w:w="0" w:type="auto"/>
-          </w:tcPr>
-          <w:p>
-            <w:pPr>
-              <w:spacing w:before="20" w:after="20"/>
-            </w:pPr>
-            <w:r>
-              <w:t xml:space="preserve">14</w:t>
-            </w:r>
-          </w:p>
-        </w:tc>
-        <w:tc>
-          <w:tcPr>
-            <w:tcW w:w="0" w:type="auto"/>
-          </w:tcPr>
-          <w:p>
-            <w:pPr>
-              <w:spacing w:before="20" w:after="20"/>
-            </w:pPr>
-            <w:r>
-              <w:t xml:space="preserve">34</w:t>
+              <w:rPr>
+                <w:b/>
+              </w:rPr>
+              <w:t xml:space="preserve">EP-03</w:t>
+            </w:r>
+            <w:r>
+              <w:t xml:space="preserve"> Acceso y gestión de pólizas Móvil (SOL-7)</w:t>
+            </w:r>
+          </w:p>
+        </w:tc>
+        <w:tc>
+          <w:tcPr>
+            <w:tcW w:w="0" w:type="auto"/>
+          </w:tcPr>
+          <w:p>
+            <w:pPr>
+              <w:spacing w:before="20" w:after="20"/>
+            </w:pPr>
+            <w:r>
+              <w:t xml:space="preserve">FE-05 Autenticación biométrica y KYC (SOL-10)</w:t>
+            </w:r>
+          </w:p>
+        </w:tc>
+        <w:tc>
+          <w:tcPr>
+            <w:tcW w:w="0" w:type="auto"/>
+          </w:tcPr>
+          <w:p>
+            <w:pPr>
+              <w:spacing w:before="20" w:after="20"/>
+            </w:pPr>
+            <w:r>
+              <w:t xml:space="preserve">FE-05.1 a FE-05.6</w:t>
+            </w:r>
+          </w:p>
+        </w:tc>
+        <w:tc>
+          <w:tcPr>
+            <w:tcW w:w="0" w:type="auto"/>
+          </w:tcPr>
+          <w:p>
+            <w:pPr>
+              <w:spacing w:before="20" w:after="20"/>
+            </w:pPr>
+            <w:r>
+              <w:t xml:space="preserve">19</w:t>
             </w:r>
           </w:p>
         </w:tc>
@@ -2500,59 +2473,46 @@
               <w:spacing w:before="20" w:after="20"/>
             </w:pPr>
             <w:r>
-              <w:t xml:space="preserve">EP-06</w:t>
-            </w:r>
-          </w:p>
-        </w:tc>
-        <w:tc>
-          <w:tcPr>
-            <w:tcW w:w="0" w:type="auto"/>
-          </w:tcPr>
-          <w:p>
-            <w:pPr>
-              <w:spacing w:before="20" w:after="20"/>
-            </w:pPr>
-            <w:r>
-              <w:t xml:space="preserve">Portal de socios distribuidores (embedded)</w:t>
-            </w:r>
-          </w:p>
-        </w:tc>
-        <w:tc>
-          <w:tcPr>
-            <w:tcW w:w="0" w:type="auto"/>
-          </w:tcPr>
-          <w:p>
-            <w:pPr>
-              <w:spacing w:before="20" w:after="20"/>
-            </w:pPr>
-            <w:r>
-              <w:t xml:space="preserve">Web / API</w:t>
-            </w:r>
-          </w:p>
-        </w:tc>
-        <w:tc>
-          <w:tcPr>
-            <w:tcW w:w="0" w:type="auto"/>
-          </w:tcPr>
-          <w:p>
-            <w:pPr>
-              <w:spacing w:before="20" w:after="20"/>
-            </w:pPr>
-            <w:r>
-              <w:t xml:space="preserve">5</w:t>
-            </w:r>
-          </w:p>
-        </w:tc>
-        <w:tc>
-          <w:tcPr>
-            <w:tcW w:w="0" w:type="auto"/>
-          </w:tcPr>
-          <w:p>
-            <w:pPr>
-              <w:spacing w:before="20" w:after="20"/>
-            </w:pPr>
-            <w:r>
-              <w:t xml:space="preserve">16</w:t>
+              <w:t/>
+            </w:r>
+          </w:p>
+        </w:tc>
+        <w:tc>
+          <w:tcPr>
+            <w:tcW w:w="0" w:type="auto"/>
+          </w:tcPr>
+          <w:p>
+            <w:pPr>
+              <w:spacing w:before="20" w:after="20"/>
+            </w:pPr>
+            <w:r>
+              <w:t xml:space="preserve">FE-06 Billetera de pólizas (SOL-11)</w:t>
+            </w:r>
+          </w:p>
+        </w:tc>
+        <w:tc>
+          <w:tcPr>
+            <w:tcW w:w="0" w:type="auto"/>
+          </w:tcPr>
+          <w:p>
+            <w:pPr>
+              <w:spacing w:before="20" w:after="20"/>
+            </w:pPr>
+            <w:r>
+              <w:t xml:space="preserve">FE-06.1 a FE-06.5</w:t>
+            </w:r>
+          </w:p>
+        </w:tc>
+        <w:tc>
+          <w:tcPr>
+            <w:tcW w:w="0" w:type="auto"/>
+          </w:tcPr>
+          <w:p>
+            <w:pPr>
+              <w:spacing w:before="20" w:after="20"/>
+            </w:pPr>
+            <w:r>
+              <w:t xml:space="preserve">12</w:t>
             </w:r>
           </w:p>
         </w:tc>
@@ -2567,59 +2527,52 @@
               <w:spacing w:before="20" w:after="20"/>
             </w:pPr>
             <w:r>
-              <w:t xml:space="preserve">EP-ARQ-01</w:t>
-            </w:r>
-          </w:p>
-        </w:tc>
-        <w:tc>
-          <w:tcPr>
-            <w:tcW w:w="0" w:type="auto"/>
-          </w:tcPr>
-          <w:p>
-            <w:pPr>
-              <w:spacing w:before="20" w:after="20"/>
-            </w:pPr>
-            <w:r>
-              <w:t xml:space="preserve">Modificabilidad y parametrización</w:t>
-            </w:r>
-          </w:p>
-        </w:tc>
-        <w:tc>
-          <w:tcPr>
-            <w:tcW w:w="0" w:type="auto"/>
-          </w:tcPr>
-          <w:p>
-            <w:pPr>
-              <w:spacing w:before="20" w:after="20"/>
-            </w:pPr>
-            <w:r>
-              <w:t xml:space="preserve">Transversal</w:t>
-            </w:r>
-          </w:p>
-        </w:tc>
-        <w:tc>
-          <w:tcPr>
-            <w:tcW w:w="0" w:type="auto"/>
-          </w:tcPr>
-          <w:p>
-            <w:pPr>
-              <w:spacing w:before="20" w:after="20"/>
-            </w:pPr>
-            <w:r>
-              <w:t xml:space="preserve">2</w:t>
-            </w:r>
-          </w:p>
-        </w:tc>
-        <w:tc>
-          <w:tcPr>
-            <w:tcW w:w="0" w:type="auto"/>
-          </w:tcPr>
-          <w:p>
-            <w:pPr>
-              <w:spacing w:before="20" w:after="20"/>
-            </w:pPr>
-            <w:r>
-              <w:t xml:space="preserve">16</w:t>
+              <w:rPr>
+                <w:b/>
+              </w:rPr>
+              <w:t xml:space="preserve">EP-04</w:t>
+            </w:r>
+            <w:r>
+              <w:t xml:space="preserve"> Siniestros y asistencia Móvil (SOL-8)</w:t>
+            </w:r>
+          </w:p>
+        </w:tc>
+        <w:tc>
+          <w:tcPr>
+            <w:tcW w:w="0" w:type="auto"/>
+          </w:tcPr>
+          <w:p>
+            <w:pPr>
+              <w:spacing w:before="20" w:after="20"/>
+            </w:pPr>
+            <w:r>
+              <w:t xml:space="preserve">FE-07 Notificaciones y asistencia (SOL-13)</w:t>
+            </w:r>
+          </w:p>
+        </w:tc>
+        <w:tc>
+          <w:tcPr>
+            <w:tcW w:w="0" w:type="auto"/>
+          </w:tcPr>
+          <w:p>
+            <w:pPr>
+              <w:spacing w:before="20" w:after="20"/>
+            </w:pPr>
+            <w:r>
+              <w:t xml:space="preserve">FE-07.1 a FE-07.4</w:t>
+            </w:r>
+          </w:p>
+        </w:tc>
+        <w:tc>
+          <w:tcPr>
+            <w:tcW w:w="0" w:type="auto"/>
+          </w:tcPr>
+          <w:p>
+            <w:pPr>
+              <w:spacing w:before="20" w:after="20"/>
+            </w:pPr>
+            <w:r>
+              <w:t xml:space="preserve">10</w:t>
             </w:r>
           </w:p>
         </w:tc>
@@ -2634,59 +2587,46 @@
               <w:spacing w:before="20" w:after="20"/>
             </w:pPr>
             <w:r>
-              <w:t xml:space="preserve">EP-ARQ-02</w:t>
-            </w:r>
-          </w:p>
-        </w:tc>
-        <w:tc>
-          <w:tcPr>
-            <w:tcW w:w="0" w:type="auto"/>
-          </w:tcPr>
-          <w:p>
-            <w:pPr>
-              <w:spacing w:before="20" w:after="20"/>
-            </w:pPr>
-            <w:r>
-              <w:t xml:space="preserve">Cumplimiento regulatorio y privacidad</w:t>
-            </w:r>
-          </w:p>
-        </w:tc>
-        <w:tc>
-          <w:tcPr>
-            <w:tcW w:w="0" w:type="auto"/>
-          </w:tcPr>
-          <w:p>
-            <w:pPr>
-              <w:spacing w:before="20" w:after="20"/>
-            </w:pPr>
-            <w:r>
-              <w:t xml:space="preserve">Transversal</w:t>
-            </w:r>
-          </w:p>
-        </w:tc>
-        <w:tc>
-          <w:tcPr>
-            <w:tcW w:w="0" w:type="auto"/>
-          </w:tcPr>
-          <w:p>
-            <w:pPr>
-              <w:spacing w:before="20" w:after="20"/>
-            </w:pPr>
-            <w:r>
-              <w:t xml:space="preserve">3</w:t>
-            </w:r>
-          </w:p>
-        </w:tc>
-        <w:tc>
-          <w:tcPr>
-            <w:tcW w:w="0" w:type="auto"/>
-          </w:tcPr>
-          <w:p>
-            <w:pPr>
-              <w:spacing w:before="20" w:after="20"/>
-            </w:pPr>
-            <w:r>
-              <w:t xml:space="preserve">21</w:t>
+              <w:t/>
+            </w:r>
+          </w:p>
+        </w:tc>
+        <w:tc>
+          <w:tcPr>
+            <w:tcW w:w="0" w:type="auto"/>
+          </w:tcPr>
+          <w:p>
+            <w:pPr>
+              <w:spacing w:before="20" w:after="20"/>
+            </w:pPr>
+            <w:r>
+              <w:t xml:space="preserve">FE-08 Reporte de siniestros con evidencia (SOL-12)</w:t>
+            </w:r>
+          </w:p>
+        </w:tc>
+        <w:tc>
+          <w:tcPr>
+            <w:tcW w:w="0" w:type="auto"/>
+          </w:tcPr>
+          <w:p>
+            <w:pPr>
+              <w:spacing w:before="20" w:after="20"/>
+            </w:pPr>
+            <w:r>
+              <w:t xml:space="preserve">FE-08.1 a FE-08.5</w:t>
+            </w:r>
+          </w:p>
+        </w:tc>
+        <w:tc>
+          <w:tcPr>
+            <w:tcW w:w="0" w:type="auto"/>
+          </w:tcPr>
+          <w:p>
+            <w:pPr>
+              <w:spacing w:before="20" w:after="20"/>
+            </w:pPr>
+            <w:r>
+              <w:t xml:space="preserve">12</w:t>
             </w:r>
           </w:p>
         </w:tc>
@@ -2701,59 +2641,52 @@
               <w:spacing w:before="20" w:after="20"/>
             </w:pPr>
             <w:r>
-              <w:t xml:space="preserve">EP-ARQ-03</w:t>
-            </w:r>
-          </w:p>
-        </w:tc>
-        <w:tc>
-          <w:tcPr>
-            <w:tcW w:w="0" w:type="auto"/>
-          </w:tcPr>
-          <w:p>
-            <w:pPr>
-              <w:spacing w:before="20" w:after="20"/>
-            </w:pPr>
-            <w:r>
-              <w:t xml:space="preserve">Contenedores y plataforma de datos</w:t>
-            </w:r>
-          </w:p>
-        </w:tc>
-        <w:tc>
-          <w:tcPr>
-            <w:tcW w:w="0" w:type="auto"/>
-          </w:tcPr>
-          <w:p>
-            <w:pPr>
-              <w:spacing w:before="20" w:after="20"/>
-            </w:pPr>
-            <w:r>
-              <w:t xml:space="preserve">Transversal</w:t>
-            </w:r>
-          </w:p>
-        </w:tc>
-        <w:tc>
-          <w:tcPr>
-            <w:tcW w:w="0" w:type="auto"/>
-          </w:tcPr>
-          <w:p>
-            <w:pPr>
-              <w:spacing w:before="20" w:after="20"/>
-            </w:pPr>
-            <w:r>
-              <w:t xml:space="preserve">3</w:t>
-            </w:r>
-          </w:p>
-        </w:tc>
-        <w:tc>
-          <w:tcPr>
-            <w:tcW w:w="0" w:type="auto"/>
-          </w:tcPr>
-          <w:p>
-            <w:pPr>
-              <w:spacing w:before="20" w:after="20"/>
-            </w:pPr>
-            <w:r>
-              <w:t xml:space="preserve">21</w:t>
+              <w:rPr>
+                <w:b/>
+              </w:rPr>
+              <w:t xml:space="preserve">EP-05</w:t>
+            </w:r>
+            <w:r>
+              <w:t xml:space="preserve"> Portal de Socios y Distribución (SOL-30)</w:t>
+            </w:r>
+          </w:p>
+        </w:tc>
+        <w:tc>
+          <w:tcPr>
+            <w:tcW w:w="0" w:type="auto"/>
+          </w:tcPr>
+          <w:p>
+            <w:pPr>
+              <w:spacing w:before="20" w:after="20"/>
+            </w:pPr>
+            <w:r>
+              <w:t xml:space="preserve">FE-09 Portal de socios distribuidores (SOL-31)</w:t>
+            </w:r>
+          </w:p>
+        </w:tc>
+        <w:tc>
+          <w:tcPr>
+            <w:tcW w:w="0" w:type="auto"/>
+          </w:tcPr>
+          <w:p>
+            <w:pPr>
+              <w:spacing w:before="20" w:after="20"/>
+            </w:pPr>
+            <w:r>
+              <w:t xml:space="preserve">FE-09.1 a FE-09.5</w:t>
+            </w:r>
+          </w:p>
+        </w:tc>
+        <w:tc>
+          <w:tcPr>
+            <w:tcW w:w="0" w:type="auto"/>
+          </w:tcPr>
+          <w:p>
+            <w:pPr>
+              <w:spacing w:before="20" w:after="20"/>
+            </w:pPr>
+            <w:r>
+              <w:t xml:space="preserve">16</w:t>
             </w:r>
           </w:p>
         </w:tc>
@@ -2768,46 +2701,291 @@
               <w:spacing w:before="20" w:after="20"/>
             </w:pPr>
             <w:r>
+              <w:rPr>
+                <w:b/>
+              </w:rPr>
+              <w:t xml:space="preserve">EP-06</w:t>
+            </w:r>
+            <w:r>
+              <w:t xml:space="preserve"> Acceso y autenticación Web </w:t>
+            </w:r>
+            <w:r>
+              <w:rPr>
+                <w:i/>
+              </w:rPr>
+              <w:t xml:space="preserve">(nueva)</w:t>
+            </w:r>
+          </w:p>
+        </w:tc>
+        <w:tc>
+          <w:tcPr>
+            <w:tcW w:w="0" w:type="auto"/>
+          </w:tcPr>
+          <w:p>
+            <w:pPr>
+              <w:spacing w:before="20" w:after="20"/>
+            </w:pPr>
+            <w:r>
+              <w:t xml:space="preserve">FE-10 Autenticación web </w:t>
+            </w:r>
+            <w:r>
+              <w:rPr>
+                <w:i/>
+              </w:rPr>
+              <w:t xml:space="preserve">(nueva)</w:t>
+            </w:r>
+          </w:p>
+        </w:tc>
+        <w:tc>
+          <w:tcPr>
+            <w:tcW w:w="0" w:type="auto"/>
+          </w:tcPr>
+          <w:p>
+            <w:pPr>
+              <w:spacing w:before="20" w:after="20"/>
+            </w:pPr>
+            <w:r>
+              <w:t xml:space="preserve">FE-10.1 a FE-10.4</w:t>
+            </w:r>
+          </w:p>
+        </w:tc>
+        <w:tc>
+          <w:tcPr>
+            <w:tcW w:w="0" w:type="auto"/>
+          </w:tcPr>
+          <w:p>
+            <w:pPr>
+              <w:spacing w:before="20" w:after="20"/>
+            </w:pPr>
+            <w:r>
+              <w:t xml:space="preserve">9</w:t>
+            </w:r>
+          </w:p>
+        </w:tc>
+      </w:tr>
+      <w:tr>
+        <w:tc>
+          <w:tcPr>
+            <w:tcW w:w="0" w:type="auto"/>
+          </w:tcPr>
+          <w:p>
+            <w:pPr>
+              <w:spacing w:before="20" w:after="20"/>
+            </w:pPr>
+            <w:r>
+              <w:rPr>
+                <w:b/>
+              </w:rPr>
+              <w:t xml:space="preserve">EP-ARQ-01</w:t>
+            </w:r>
+            <w:r>
+              <w:t xml:space="preserve"> Multi-región e internacionalización (SOL-15)</w:t>
+            </w:r>
+          </w:p>
+        </w:tc>
+        <w:tc>
+          <w:tcPr>
+            <w:tcW w:w="0" w:type="auto"/>
+          </w:tcPr>
+          <w:p>
+            <w:pPr>
+              <w:spacing w:before="20" w:after="20"/>
+            </w:pPr>
+            <w:r>
+              <w:t xml:space="preserve">—</w:t>
+            </w:r>
+          </w:p>
+        </w:tc>
+        <w:tc>
+          <w:tcPr>
+            <w:tcW w:w="0" w:type="auto"/>
+          </w:tcPr>
+          <w:p>
+            <w:pPr>
+              <w:spacing w:before="20" w:after="20"/>
+            </w:pPr>
+            <w:r>
+              <w:t xml:space="preserve">HU-ARQ-01, HU-ARQ-02</w:t>
+            </w:r>
+          </w:p>
+        </w:tc>
+        <w:tc>
+          <w:tcPr>
+            <w:tcW w:w="0" w:type="auto"/>
+          </w:tcPr>
+          <w:p>
+            <w:pPr>
+              <w:spacing w:before="20" w:after="20"/>
+            </w:pPr>
+            <w:r>
+              <w:t xml:space="preserve">16</w:t>
+            </w:r>
+          </w:p>
+        </w:tc>
+      </w:tr>
+      <w:tr>
+        <w:tc>
+          <w:tcPr>
+            <w:tcW w:w="0" w:type="auto"/>
+          </w:tcPr>
+          <w:p>
+            <w:pPr>
+              <w:spacing w:before="20" w:after="20"/>
+            </w:pPr>
+            <w:r>
+              <w:rPr>
+                <w:b/>
+              </w:rPr>
+              <w:t xml:space="preserve">EP-ARQ-02</w:t>
+            </w:r>
+            <w:r>
+              <w:t xml:space="preserve"> Cumplimiento regulatorio y privacidad (SOL-16)</w:t>
+            </w:r>
+          </w:p>
+        </w:tc>
+        <w:tc>
+          <w:tcPr>
+            <w:tcW w:w="0" w:type="auto"/>
+          </w:tcPr>
+          <w:p>
+            <w:pPr>
+              <w:spacing w:before="20" w:after="20"/>
+            </w:pPr>
+            <w:r>
+              <w:t xml:space="preserve">—</w:t>
+            </w:r>
+          </w:p>
+        </w:tc>
+        <w:tc>
+          <w:tcPr>
+            <w:tcW w:w="0" w:type="auto"/>
+          </w:tcPr>
+          <w:p>
+            <w:pPr>
+              <w:spacing w:before="20" w:after="20"/>
+            </w:pPr>
+            <w:r>
+              <w:t xml:space="preserve">HU-ARQ-03, HU-ARQ-04, HU-ARQ-11</w:t>
+            </w:r>
+          </w:p>
+        </w:tc>
+        <w:tc>
+          <w:tcPr>
+            <w:tcW w:w="0" w:type="auto"/>
+          </w:tcPr>
+          <w:p>
+            <w:pPr>
+              <w:spacing w:before="20" w:after="20"/>
+            </w:pPr>
+            <w:r>
+              <w:t xml:space="preserve">21</w:t>
+            </w:r>
+          </w:p>
+        </w:tc>
+      </w:tr>
+      <w:tr>
+        <w:tc>
+          <w:tcPr>
+            <w:tcW w:w="0" w:type="auto"/>
+          </w:tcPr>
+          <w:p>
+            <w:pPr>
+              <w:spacing w:before="20" w:after="20"/>
+            </w:pPr>
+            <w:r>
+              <w:rPr>
+                <w:b/>
+              </w:rPr>
+              <w:t xml:space="preserve">EP-ARQ-03</w:t>
+            </w:r>
+            <w:r>
+              <w:t xml:space="preserve"> Contenedores y plataforma de datos (SOL-25)</w:t>
+            </w:r>
+          </w:p>
+        </w:tc>
+        <w:tc>
+          <w:tcPr>
+            <w:tcW w:w="0" w:type="auto"/>
+          </w:tcPr>
+          <w:p>
+            <w:pPr>
+              <w:spacing w:before="20" w:after="20"/>
+            </w:pPr>
+            <w:r>
+              <w:t xml:space="preserve">—</w:t>
+            </w:r>
+          </w:p>
+        </w:tc>
+        <w:tc>
+          <w:tcPr>
+            <w:tcW w:w="0" w:type="auto"/>
+          </w:tcPr>
+          <w:p>
+            <w:pPr>
+              <w:spacing w:before="20" w:after="20"/>
+            </w:pPr>
+            <w:r>
+              <w:t xml:space="preserve">HU-ARQ-05, HU-ARQ-08, HU-ARQ-10</w:t>
+            </w:r>
+          </w:p>
+        </w:tc>
+        <w:tc>
+          <w:tcPr>
+            <w:tcW w:w="0" w:type="auto"/>
+          </w:tcPr>
+          <w:p>
+            <w:pPr>
+              <w:spacing w:before="20" w:after="20"/>
+            </w:pPr>
+            <w:r>
+              <w:t xml:space="preserve">21</w:t>
+            </w:r>
+          </w:p>
+        </w:tc>
+      </w:tr>
+      <w:tr>
+        <w:tc>
+          <w:tcPr>
+            <w:tcW w:w="0" w:type="auto"/>
+          </w:tcPr>
+          <w:p>
+            <w:pPr>
+              <w:spacing w:before="20" w:after="20"/>
+            </w:pPr>
+            <w:r>
+              <w:rPr>
+                <w:b/>
+              </w:rPr>
               <w:t xml:space="preserve">EP-ARQ-04</w:t>
             </w:r>
-          </w:p>
-        </w:tc>
-        <w:tc>
-          <w:tcPr>
-            <w:tcW w:w="0" w:type="auto"/>
-          </w:tcPr>
-          <w:p>
-            <w:pPr>
-              <w:spacing w:before="20" w:after="20"/>
-            </w:pPr>
-            <w:r>
-              <w:t xml:space="preserve">Escalabilidad y desempeño</w:t>
-            </w:r>
-          </w:p>
-        </w:tc>
-        <w:tc>
-          <w:tcPr>
-            <w:tcW w:w="0" w:type="auto"/>
-          </w:tcPr>
-          <w:p>
-            <w:pPr>
-              <w:spacing w:before="20" w:after="20"/>
-            </w:pPr>
-            <w:r>
-              <w:t xml:space="preserve">Transversal</w:t>
-            </w:r>
-          </w:p>
-        </w:tc>
-        <w:tc>
-          <w:tcPr>
-            <w:tcW w:w="0" w:type="auto"/>
-          </w:tcPr>
-          <w:p>
-            <w:pPr>
-              <w:spacing w:before="20" w:after="20"/>
-            </w:pPr>
-            <w:r>
-              <w:t xml:space="preserve">3</w:t>
+            <w:r>
+              <w:t xml:space="preserve"> Escalabilidad y desempeño (SOL-27)</w:t>
+            </w:r>
+          </w:p>
+        </w:tc>
+        <w:tc>
+          <w:tcPr>
+            <w:tcW w:w="0" w:type="auto"/>
+          </w:tcPr>
+          <w:p>
+            <w:pPr>
+              <w:spacing w:before="20" w:after="20"/>
+            </w:pPr>
+            <w:r>
+              <w:t xml:space="preserve">—</w:t>
+            </w:r>
+          </w:p>
+        </w:tc>
+        <w:tc>
+          <w:tcPr>
+            <w:tcW w:w="0" w:type="auto"/>
+          </w:tcPr>
+          <w:p>
+            <w:pPr>
+              <w:spacing w:before="20" w:after="20"/>
+            </w:pPr>
+            <w:r>
+              <w:t xml:space="preserve">HU-ARQ-06, HU-ARQ-07, HU-ARQ-09</w:t>
             </w:r>
           </w:p>
         </w:tc>
@@ -2851,36 +3029,26 @@
               <w:spacing w:before="20" w:after="20"/>
             </w:pPr>
             <w:r>
-              <w:t/>
-            </w:r>
-          </w:p>
-        </w:tc>
-        <w:tc>
-          <w:tcPr>
-            <w:tcW w:w="0" w:type="auto"/>
-          </w:tcPr>
-          <w:p>
-            <w:pPr>
-              <w:spacing w:before="20" w:after="20"/>
-            </w:pPr>
-            <w:r>
-              <w:t/>
-            </w:r>
-          </w:p>
-        </w:tc>
-        <w:tc>
-          <w:tcPr>
-            <w:tcW w:w="0" w:type="auto"/>
-          </w:tcPr>
-          <w:p>
-            <w:pPr>
-              <w:spacing w:before="20" w:after="20"/>
-            </w:pPr>
-            <w:r>
               <w:rPr>
                 <w:b/>
               </w:rPr>
-              <w:t xml:space="preserve">62</w:t>
+              <w:t xml:space="preserve">10 funciones</w:t>
+            </w:r>
+          </w:p>
+        </w:tc>
+        <w:tc>
+          <w:tcPr>
+            <w:tcW w:w="0" w:type="auto"/>
+          </w:tcPr>
+          <w:p>
+            <w:pPr>
+              <w:spacing w:before="20" w:after="20"/>
+            </w:pPr>
+            <w:r>
+              <w:rPr>
+                <w:b/>
+              </w:rPr>
+              <w:t xml:space="preserve">62 historias</w:t>
             </w:r>
           </w:p>
         </w:tc>
@@ -2905,6 +3073,11 @@
     <w:p>
       <w:r>
         <w:t/>
+      </w:r>
+    </w:p>
+    <w:p>
+      <w:r>
+        <w:t xml:space="preserve">Las historias de arquitectura cuelgan directamente de su épica sin nivel de función intermedio, porque no representan funcionalidad de cara al usuario sino propiedades transversales del sistema.</w:t>
       </w:r>
     </w:p>
     <w:p>
@@ -3447,7 +3620,7 @@
         <w:pStyle w:val="Heading3"/>
       </w:pPr>
       <w:r>
-        <w:t xml:space="preserve">EP-01 — Venta asistida (Web) · 12 historias · 31 SP</w:t>
+        <w:t xml:space="preserve">EP-01 · Gestión de seguros Web (SOL-1) — Funciones FE-01, FE-02 y FE-03 · 17 historias · 44 SP</w:t>
       </w:r>
     </w:p>
     <w:p>
@@ -3605,7 +3778,7 @@
         <w:rPr>
           <w:b/>
         </w:rPr>
-        <w:t xml:space="preserve">Jira origen:</w:t>
+        <w:t xml:space="preserve">Función padre:</w:t>
       </w:r>
       <w:r>
         <w:t xml:space="preserve"> SOL-3</w:t>
@@ -3756,7 +3929,7 @@
         <w:rPr>
           <w:b/>
         </w:rPr>
-        <w:t xml:space="preserve">Jira origen:</w:t>
+        <w:t xml:space="preserve">Función padre:</w:t>
       </w:r>
       <w:r>
         <w:t xml:space="preserve"> SOL-3</w:t>
@@ -3907,7 +4080,7 @@
         <w:rPr>
           <w:b/>
         </w:rPr>
-        <w:t xml:space="preserve">Jira origen:</w:t>
+        <w:t xml:space="preserve">Función padre:</w:t>
       </w:r>
       <w:r>
         <w:t xml:space="preserve"> SOL-3</w:t>
@@ -4058,7 +4231,7 @@
         <w:rPr>
           <w:b/>
         </w:rPr>
-        <w:t xml:space="preserve">Jira origen:</w:t>
+        <w:t xml:space="preserve">Función padre:</w:t>
       </w:r>
       <w:r>
         <w:t xml:space="preserve"> SOL-3</w:t>
@@ -4209,7 +4382,7 @@
         <w:rPr>
           <w:b/>
         </w:rPr>
-        <w:t xml:space="preserve">Jira origen:</w:t>
+        <w:t xml:space="preserve">Función padre:</w:t>
       </w:r>
       <w:r>
         <w:t xml:space="preserve"> SOL-3</w:t>
@@ -4360,7 +4533,7 @@
         <w:rPr>
           <w:b/>
         </w:rPr>
-        <w:t xml:space="preserve">Jira origen:</w:t>
+        <w:t xml:space="preserve">Función padre:</w:t>
       </w:r>
       <w:r>
         <w:t xml:space="preserve"> SOL-3</w:t>
@@ -4511,7 +4684,7 @@
         <w:rPr>
           <w:b/>
         </w:rPr>
-        <w:t xml:space="preserve">Jira origen:</w:t>
+        <w:t xml:space="preserve">Función padre:</w:t>
       </w:r>
       <w:r>
         <w:t xml:space="preserve"> SOL-4</w:t>
@@ -4662,7 +4835,7 @@
         <w:rPr>
           <w:b/>
         </w:rPr>
-        <w:t xml:space="preserve">Jira origen:</w:t>
+        <w:t xml:space="preserve">Función padre:</w:t>
       </w:r>
       <w:r>
         <w:t xml:space="preserve"> SOL-4</w:t>
@@ -4813,7 +4986,7 @@
         <w:rPr>
           <w:b/>
         </w:rPr>
-        <w:t xml:space="preserve">Jira origen:</w:t>
+        <w:t xml:space="preserve">Función padre:</w:t>
       </w:r>
       <w:r>
         <w:t xml:space="preserve"> SOL-4</w:t>
@@ -4964,7 +5137,7 @@
         <w:rPr>
           <w:b/>
         </w:rPr>
-        <w:t xml:space="preserve">Jira origen:</w:t>
+        <w:t xml:space="preserve">Función padre:</w:t>
       </w:r>
       <w:r>
         <w:t xml:space="preserve"> SOL-4</w:t>
@@ -5115,7 +5288,7 @@
         <w:rPr>
           <w:b/>
         </w:rPr>
-        <w:t xml:space="preserve">Jira origen:</w:t>
+        <w:t xml:space="preserve">Función padre:</w:t>
       </w:r>
       <w:r>
         <w:t xml:space="preserve"> SOL-4</w:t>
@@ -5266,7 +5439,7 @@
         <w:rPr>
           <w:b/>
         </w:rPr>
-        <w:t xml:space="preserve">Jira origen:</w:t>
+        <w:t xml:space="preserve">Función padre:</w:t>
       </w:r>
       <w:r>
         <w:t xml:space="preserve"> SOL-4</w:t>
@@ -5284,7 +5457,7 @@
         <w:pStyle w:val="Heading3"/>
       </w:pPr>
       <w:r>
-        <w:t xml:space="preserve">EP-02 — Administración y operación de pólizas (Web) · 10 historias · 28 SP</w:t>
+        <w:t xml:space="preserve">EP-02 · Gestión de siniestros Web (SOL-2) — Función FE-04 · 5 historias · 15 SP</w:t>
       </w:r>
     </w:p>
     <w:p>
@@ -5433,7 +5606,7 @@
         <w:rPr>
           <w:b/>
         </w:rPr>
-        <w:t xml:space="preserve">Jira origen:</w:t>
+        <w:t xml:space="preserve">Función padre:</w:t>
       </w:r>
       <w:r>
         <w:t xml:space="preserve"> SOL-5</w:t>
@@ -5584,7 +5757,7 @@
         <w:rPr>
           <w:b/>
         </w:rPr>
-        <w:t xml:space="preserve">Jira origen:</w:t>
+        <w:t xml:space="preserve">Función padre:</w:t>
       </w:r>
       <w:r>
         <w:t xml:space="preserve"> SOL-5</w:t>
@@ -5735,7 +5908,7 @@
         <w:rPr>
           <w:b/>
         </w:rPr>
-        <w:t xml:space="preserve">Jira origen:</w:t>
+        <w:t xml:space="preserve">Función padre:</w:t>
       </w:r>
       <w:r>
         <w:t xml:space="preserve"> SOL-5</w:t>
@@ -5886,7 +6059,7 @@
         <w:rPr>
           <w:b/>
         </w:rPr>
-        <w:t xml:space="preserve">Jira origen:</w:t>
+        <w:t xml:space="preserve">Función padre:</w:t>
       </w:r>
       <w:r>
         <w:t xml:space="preserve"> SOL-5</w:t>
@@ -6037,7 +6210,7 @@
         <w:rPr>
           <w:b/>
         </w:rPr>
-        <w:t xml:space="preserve">Jira origen:</w:t>
+        <w:t xml:space="preserve">Función padre:</w:t>
       </w:r>
       <w:r>
         <w:t xml:space="preserve"> SOL-5</w:t>
@@ -6188,7 +6361,7 @@
         <w:rPr>
           <w:b/>
         </w:rPr>
-        <w:t xml:space="preserve">Jira origen:</w:t>
+        <w:t xml:space="preserve">Función padre:</w:t>
       </w:r>
       <w:r>
         <w:t xml:space="preserve"> SOL-6</w:t>
@@ -6339,7 +6512,7 @@
         <w:rPr>
           <w:b/>
         </w:rPr>
-        <w:t xml:space="preserve">Jira origen:</w:t>
+        <w:t xml:space="preserve">Función padre:</w:t>
       </w:r>
       <w:r>
         <w:t xml:space="preserve"> SOL-6</w:t>
@@ -6490,7 +6663,7 @@
         <w:rPr>
           <w:b/>
         </w:rPr>
-        <w:t xml:space="preserve">Jira origen:</w:t>
+        <w:t xml:space="preserve">Función padre:</w:t>
       </w:r>
       <w:r>
         <w:t xml:space="preserve"> SOL-6</w:t>
@@ -6641,7 +6814,7 @@
         <w:rPr>
           <w:b/>
         </w:rPr>
-        <w:t xml:space="preserve">Jira origen:</w:t>
+        <w:t xml:space="preserve">Función padre:</w:t>
       </w:r>
       <w:r>
         <w:t xml:space="preserve"> SOL-6</w:t>
@@ -6792,7 +6965,7 @@
         <w:rPr>
           <w:b/>
         </w:rPr>
-        <w:t xml:space="preserve">Jira origen:</w:t>
+        <w:t xml:space="preserve">Función padre:</w:t>
       </w:r>
       <w:r>
         <w:t xml:space="preserve"> SOL-6</w:t>
@@ -6810,7 +6983,7 @@
         <w:pStyle w:val="Heading3"/>
       </w:pPr>
       <w:r>
-        <w:t xml:space="preserve">EP-03 — Acceso y autenticación web · 4 historias · 9 SP</w:t>
+        <w:t xml:space="preserve">EP-06 · Acceso y autenticación Web (nueva) — Función FE-10 (nueva) · 4 historias · 9 SP</w:t>
       </w:r>
     </w:p>
     <w:p>
@@ -6832,7 +7005,7 @@
         <w:pStyle w:val="Heading4"/>
       </w:pPr>
       <w:r>
-        <w:t xml:space="preserve">FE-05.1 — Registrarse en el portal con verificación de correo</w:t>
+        <w:t xml:space="preserve">FE-10.1 — Registrarse en el portal con verificación de correo</w:t>
       </w:r>
     </w:p>
     <w:p>
@@ -6965,7 +7138,7 @@
         <w:rPr>
           <w:b/>
         </w:rPr>
-        <w:t xml:space="preserve">Jira origen:</w:t>
+        <w:t xml:space="preserve">Función padre:</w:t>
       </w:r>
       <w:r>
         <w:t xml:space="preserve"> </w:t>
@@ -6989,7 +7162,7 @@
         <w:pStyle w:val="Heading4"/>
       </w:pPr>
       <w:r>
-        <w:t xml:space="preserve">FE-05.2 — Iniciar sesión con segundo factor</w:t>
+        <w:t xml:space="preserve">FE-10.2 — Iniciar sesión con segundo factor</w:t>
       </w:r>
     </w:p>
     <w:p>
@@ -7122,7 +7295,7 @@
         <w:rPr>
           <w:b/>
         </w:rPr>
-        <w:t xml:space="preserve">Jira origen:</w:t>
+        <w:t xml:space="preserve">Función padre:</w:t>
       </w:r>
       <w:r>
         <w:t xml:space="preserve"> </w:t>
@@ -7146,7 +7319,7 @@
         <w:pStyle w:val="Heading4"/>
       </w:pPr>
       <w:r>
-        <w:t xml:space="preserve">FE-05.3 — Recuperar el acceso a la cuenta</w:t>
+        <w:t xml:space="preserve">FE-10.3 — Recuperar el acceso a la cuenta</w:t>
       </w:r>
     </w:p>
     <w:p>
@@ -7279,7 +7452,7 @@
         <w:rPr>
           <w:b/>
         </w:rPr>
-        <w:t xml:space="preserve">Jira origen:</w:t>
+        <w:t xml:space="preserve">Función padre:</w:t>
       </w:r>
       <w:r>
         <w:t xml:space="preserve"> </w:t>
@@ -7303,7 +7476,7 @@
         <w:pStyle w:val="Heading4"/>
       </w:pPr>
       <w:r>
-        <w:t xml:space="preserve">FE-05.4 — Cerrar sesión y expirar por inactividad</w:t>
+        <w:t xml:space="preserve">FE-10.4 — Cerrar sesión y expirar por inactividad</w:t>
       </w:r>
     </w:p>
     <w:p>
@@ -7436,7 +7609,7 @@
         <w:rPr>
           <w:b/>
         </w:rPr>
-        <w:t xml:space="preserve">Jira origen:</w:t>
+        <w:t xml:space="preserve">Función padre:</w:t>
       </w:r>
       <w:r>
         <w:t xml:space="preserve"> </w:t>
@@ -7460,7 +7633,7 @@
         <w:pStyle w:val="Heading3"/>
       </w:pPr>
       <w:r>
-        <w:t xml:space="preserve">EP-04 — Identidad y acceso móvil (Móvil) · 6 historias · 19 SP</w:t>
+        <w:t xml:space="preserve">EP-03 · Acceso y gestión de pólizas Móvil (SOL-7) — Funciones FE-05 y FE-06 · 11 historias · 31 SP</w:t>
       </w:r>
     </w:p>
     <w:p>
@@ -7476,7 +7649,7 @@
         <w:pStyle w:val="Heading4"/>
       </w:pPr>
       <w:r>
-        <w:t xml:space="preserve">FE-06.1 — Capturar el documento de identidad</w:t>
+        <w:t xml:space="preserve">FE-05.1 — Capturar el documento de identidad</w:t>
       </w:r>
     </w:p>
     <w:p>
@@ -7609,7 +7782,7 @@
         <w:rPr>
           <w:b/>
         </w:rPr>
-        <w:t xml:space="preserve">Jira origen:</w:t>
+        <w:t xml:space="preserve">Función padre:</w:t>
       </w:r>
       <w:r>
         <w:t xml:space="preserve"> SOL-10</w:t>
@@ -7627,7 +7800,7 @@
         <w:pStyle w:val="Heading4"/>
       </w:pPr>
       <w:r>
-        <w:t xml:space="preserve">FE-06.2 — Verificar la identidad con prueba de vida</w:t>
+        <w:t xml:space="preserve">FE-05.2 — Verificar la identidad con prueba de vida</w:t>
       </w:r>
     </w:p>
     <w:p>
@@ -7760,7 +7933,7 @@
         <w:rPr>
           <w:b/>
         </w:rPr>
-        <w:t xml:space="preserve">Jira origen:</w:t>
+        <w:t xml:space="preserve">Función padre:</w:t>
       </w:r>
       <w:r>
         <w:t xml:space="preserve"> SOL-10</w:t>
@@ -7778,7 +7951,7 @@
         <w:pStyle w:val="Heading4"/>
       </w:pPr>
       <w:r>
-        <w:t xml:space="preserve">FE-06.3 — Validar contra listas restrictivas</w:t>
+        <w:t xml:space="preserve">FE-05.3 — Validar contra listas restrictivas</w:t>
       </w:r>
     </w:p>
     <w:p>
@@ -7911,7 +8084,7 @@
         <w:rPr>
           <w:b/>
         </w:rPr>
-        <w:t xml:space="preserve">Jira origen:</w:t>
+        <w:t xml:space="preserve">Función padre:</w:t>
       </w:r>
       <w:r>
         <w:t xml:space="preserve"> SOL-10</w:t>
@@ -7929,7 +8102,7 @@
         <w:pStyle w:val="Heading4"/>
       </w:pPr>
       <w:r>
-        <w:t xml:space="preserve">FE-06.4 — Otorgar consentimiento Open Finance desde el móvil</w:t>
+        <w:t xml:space="preserve">FE-05.4 — Otorgar consentimiento Open Finance desde el móvil</w:t>
       </w:r>
     </w:p>
     <w:p>
@@ -8062,7 +8235,7 @@
         <w:rPr>
           <w:b/>
         </w:rPr>
-        <w:t xml:space="preserve">Jira origen:</w:t>
+        <w:t xml:space="preserve">Función padre:</w:t>
       </w:r>
       <w:r>
         <w:t xml:space="preserve"> SOL-10</w:t>
@@ -8080,7 +8253,7 @@
         <w:pStyle w:val="Heading4"/>
       </w:pPr>
       <w:r>
-        <w:t xml:space="preserve">FE-06.5 — Iniciar sesión con la biometría del dispositivo</w:t>
+        <w:t xml:space="preserve">FE-05.5 — Iniciar sesión con la biometría del dispositivo</w:t>
       </w:r>
     </w:p>
     <w:p>
@@ -8213,7 +8386,7 @@
         <w:rPr>
           <w:b/>
         </w:rPr>
-        <w:t xml:space="preserve">Jira origen:</w:t>
+        <w:t xml:space="preserve">Función padre:</w:t>
       </w:r>
       <w:r>
         <w:t xml:space="preserve"> SOL-10</w:t>
@@ -8231,7 +8404,7 @@
         <w:pStyle w:val="Heading4"/>
       </w:pPr>
       <w:r>
-        <w:t xml:space="preserve">FE-06.6 — Reintentar el onboarding tras un rechazo</w:t>
+        <w:t xml:space="preserve">FE-05.6 — Reintentar el onboarding tras un rechazo</w:t>
       </w:r>
     </w:p>
     <w:p>
@@ -8364,7 +8537,7 @@
         <w:rPr>
           <w:b/>
         </w:rPr>
-        <w:t xml:space="preserve">Jira origen:</w:t>
+        <w:t xml:space="preserve">Función padre:</w:t>
       </w:r>
       <w:r>
         <w:t xml:space="preserve"> SOL-10</w:t>
@@ -8382,7 +8555,7 @@
         <w:pStyle w:val="Heading3"/>
       </w:pPr>
       <w:r>
-        <w:t xml:space="preserve">EP-05 — Autogestión móvil · 14 historias · 34 SP</w:t>
+        <w:t xml:space="preserve">EP-04 · Siniestros y asistencia Móvil (SOL-8) — Funciones FE-07 y FE-08 · 9 historias · 22 SP</w:t>
       </w:r>
     </w:p>
     <w:p>
@@ -8398,7 +8571,7 @@
         <w:pStyle w:val="Heading4"/>
       </w:pPr>
       <w:r>
-        <w:t xml:space="preserve">FE-07.1 — Ver las pólizas activas en la billetera</w:t>
+        <w:t xml:space="preserve">FE-06.1 — Ver las pólizas activas en la billetera</w:t>
       </w:r>
     </w:p>
     <w:p>
@@ -8531,7 +8704,7 @@
         <w:rPr>
           <w:b/>
         </w:rPr>
-        <w:t xml:space="preserve">Jira origen:</w:t>
+        <w:t xml:space="preserve">Función padre:</w:t>
       </w:r>
       <w:r>
         <w:t xml:space="preserve"> SOL-11</w:t>
@@ -8549,7 +8722,7 @@
         <w:pStyle w:val="Heading4"/>
       </w:pPr>
       <w:r>
-        <w:t xml:space="preserve">FE-07.2 — Consultar las pólizas sin conexión</w:t>
+        <w:t xml:space="preserve">FE-06.2 — Consultar las pólizas sin conexión</w:t>
       </w:r>
     </w:p>
     <w:p>
@@ -8682,7 +8855,7 @@
         <w:rPr>
           <w:b/>
         </w:rPr>
-        <w:t xml:space="preserve">Jira origen:</w:t>
+        <w:t xml:space="preserve">Función padre:</w:t>
       </w:r>
       <w:r>
         <w:t xml:space="preserve"> SOL-11</w:t>
@@ -8700,7 +8873,7 @@
         <w:pStyle w:val="Heading4"/>
       </w:pPr>
       <w:r>
-        <w:t xml:space="preserve">FE-07.3 — Descargar el certificado al dispositivo</w:t>
+        <w:t xml:space="preserve">FE-06.3 — Descargar el certificado al dispositivo</w:t>
       </w:r>
     </w:p>
     <w:p>
@@ -8833,7 +9006,7 @@
         <w:rPr>
           <w:b/>
         </w:rPr>
-        <w:t xml:space="preserve">Jira origen:</w:t>
+        <w:t xml:space="preserve">Función padre:</w:t>
       </w:r>
       <w:r>
         <w:t xml:space="preserve"> SOL-11</w:t>
@@ -8851,7 +9024,7 @@
         <w:pStyle w:val="Heading4"/>
       </w:pPr>
       <w:r>
-        <w:t xml:space="preserve">FE-07.4 — Sincronizar al recuperar conectividad</w:t>
+        <w:t xml:space="preserve">FE-06.4 — Sincronizar al recuperar conectividad</w:t>
       </w:r>
     </w:p>
     <w:p>
@@ -8984,7 +9157,7 @@
         <w:rPr>
           <w:b/>
         </w:rPr>
-        <w:t xml:space="preserve">Jira origen:</w:t>
+        <w:t xml:space="preserve">Función padre:</w:t>
       </w:r>
       <w:r>
         <w:t xml:space="preserve"> SOL-11</w:t>
@@ -9002,7 +9175,7 @@
         <w:pStyle w:val="Heading4"/>
       </w:pPr>
       <w:r>
-        <w:t xml:space="preserve">FE-07.5 — Ver alerta de datos desactualizados</w:t>
+        <w:t xml:space="preserve">FE-06.5 — Ver alerta de datos desactualizados</w:t>
       </w:r>
     </w:p>
     <w:p>
@@ -9135,7 +9308,7 @@
         <w:rPr>
           <w:b/>
         </w:rPr>
-        <w:t xml:space="preserve">Jira origen:</w:t>
+        <w:t xml:space="preserve">Función padre:</w:t>
       </w:r>
       <w:r>
         <w:t xml:space="preserve"> SOL-11</w:t>
@@ -9286,7 +9459,7 @@
         <w:rPr>
           <w:b/>
         </w:rPr>
-        <w:t xml:space="preserve">Jira origen:</w:t>
+        <w:t xml:space="preserve">Función padre:</w:t>
       </w:r>
       <w:r>
         <w:t xml:space="preserve"> SOL-12</w:t>
@@ -9437,7 +9610,7 @@
         <w:rPr>
           <w:b/>
         </w:rPr>
-        <w:t xml:space="preserve">Jira origen:</w:t>
+        <w:t xml:space="preserve">Función padre:</w:t>
       </w:r>
       <w:r>
         <w:t xml:space="preserve"> SOL-12</w:t>
@@ -9588,7 +9761,7 @@
         <w:rPr>
           <w:b/>
         </w:rPr>
-        <w:t xml:space="preserve">Jira origen:</w:t>
+        <w:t xml:space="preserve">Función padre:</w:t>
       </w:r>
       <w:r>
         <w:t xml:space="preserve"> SOL-12</w:t>
@@ -9739,7 +9912,7 @@
         <w:rPr>
           <w:b/>
         </w:rPr>
-        <w:t xml:space="preserve">Jira origen:</w:t>
+        <w:t xml:space="preserve">Función padre:</w:t>
       </w:r>
       <w:r>
         <w:t xml:space="preserve"> SOL-12</w:t>
@@ -9890,7 +10063,7 @@
         <w:rPr>
           <w:b/>
         </w:rPr>
-        <w:t xml:space="preserve">Jira origen:</w:t>
+        <w:t xml:space="preserve">Función padre:</w:t>
       </w:r>
       <w:r>
         <w:t xml:space="preserve"> SOL-12</w:t>
@@ -9908,7 +10081,7 @@
         <w:pStyle w:val="Heading4"/>
       </w:pPr>
       <w:r>
-        <w:t xml:space="preserve">FE-09.1 — Recibir notificaciones de póliza y siniestro</w:t>
+        <w:t xml:space="preserve">FE-07.1 — Recibir notificaciones de póliza y siniestro</w:t>
       </w:r>
     </w:p>
     <w:p>
@@ -10041,7 +10214,7 @@
         <w:rPr>
           <w:b/>
         </w:rPr>
-        <w:t xml:space="preserve">Jira origen:</w:t>
+        <w:t xml:space="preserve">Función padre:</w:t>
       </w:r>
       <w:r>
         <w:t xml:space="preserve"> SOL-13</w:t>
@@ -10059,7 +10232,7 @@
         <w:pStyle w:val="Heading4"/>
       </w:pPr>
       <w:r>
-        <w:t xml:space="preserve">FE-09.2 — Configurar las preferencias de notificación</w:t>
+        <w:t xml:space="preserve">FE-07.2 — Configurar las preferencias de notificación</w:t>
       </w:r>
     </w:p>
     <w:p>
@@ -10192,7 +10365,7 @@
         <w:rPr>
           <w:b/>
         </w:rPr>
-        <w:t xml:space="preserve">Jira origen:</w:t>
+        <w:t xml:space="preserve">Función padre:</w:t>
       </w:r>
       <w:r>
         <w:t xml:space="preserve"> SOL-13</w:t>
@@ -10210,7 +10383,7 @@
         <w:pStyle w:val="Heading4"/>
       </w:pPr>
       <w:r>
-        <w:t xml:space="preserve">FE-09.3 — Solicitar asistencia geolocalizada</w:t>
+        <w:t xml:space="preserve">FE-07.3 — Solicitar asistencia geolocalizada</w:t>
       </w:r>
     </w:p>
     <w:p>
@@ -10343,7 +10516,7 @@
         <w:rPr>
           <w:b/>
         </w:rPr>
-        <w:t xml:space="preserve">Jira origen:</w:t>
+        <w:t xml:space="preserve">Función padre:</w:t>
       </w:r>
       <w:r>
         <w:t xml:space="preserve"> SOL-13</w:t>
@@ -10361,7 +10534,7 @@
         <w:pStyle w:val="Heading4"/>
       </w:pPr>
       <w:r>
-        <w:t xml:space="preserve">FE-09.4 — Contactar a un asesor desde la app</w:t>
+        <w:t xml:space="preserve">FE-07.4 — Contactar a un asesor desde la app</w:t>
       </w:r>
     </w:p>
     <w:p>
@@ -10494,7 +10667,7 @@
         <w:rPr>
           <w:b/>
         </w:rPr>
-        <w:t xml:space="preserve">Jira origen:</w:t>
+        <w:t xml:space="preserve">Función padre:</w:t>
       </w:r>
       <w:r>
         <w:t xml:space="preserve"> SOL-13</w:t>
@@ -10512,7 +10685,7 @@
         <w:pStyle w:val="Heading3"/>
       </w:pPr>
       <w:r>
-        <w:t xml:space="preserve">EP-06 — Portal de socios distribuidores · 5 historias · 16 SP</w:t>
+        <w:t xml:space="preserve">EP-05 · Portal de Socios y Distribución (SOL-30) — Función FE-09 · 5 historias · 16 SP</w:t>
       </w:r>
     </w:p>
     <w:p>
@@ -10528,7 +10701,7 @@
         <w:pStyle w:val="Heading4"/>
       </w:pPr>
       <w:r>
-        <w:t xml:space="preserve">FE-10.1 — Registrar un socio distribuidor</w:t>
+        <w:t xml:space="preserve">FE-09.1 — Registrar un socio distribuidor</w:t>
       </w:r>
     </w:p>
     <w:p>
@@ -10661,7 +10834,7 @@
         <w:rPr>
           <w:b/>
         </w:rPr>
-        <w:t xml:space="preserve">Jira origen:</w:t>
+        <w:t xml:space="preserve">Función padre:</w:t>
       </w:r>
       <w:r>
         <w:t xml:space="preserve"> SOL-31</w:t>
@@ -10679,7 +10852,7 @@
         <w:pStyle w:val="Heading4"/>
       </w:pPr>
       <w:r>
-        <w:t xml:space="preserve">FE-10.2 — Generar y rotar las llaves de API</w:t>
+        <w:t xml:space="preserve">FE-09.2 — Generar y rotar las llaves de API</w:t>
       </w:r>
     </w:p>
     <w:p>
@@ -10812,7 +10985,7 @@
         <w:rPr>
           <w:b/>
         </w:rPr>
-        <w:t xml:space="preserve">Jira origen:</w:t>
+        <w:t xml:space="preserve">Función padre:</w:t>
       </w:r>
       <w:r>
         <w:t xml:space="preserve"> SOL-31</w:t>
@@ -10830,7 +11003,7 @@
         <w:pStyle w:val="Heading4"/>
       </w:pPr>
       <w:r>
-        <w:t xml:space="preserve">FE-10.3 — Consultar el catálogo de ramos por API</w:t>
+        <w:t xml:space="preserve">FE-09.3 — Consultar el catálogo de ramos por API</w:t>
       </w:r>
     </w:p>
     <w:p>
@@ -10963,7 +11136,7 @@
         <w:rPr>
           <w:b/>
         </w:rPr>
-        <w:t xml:space="preserve">Jira origen:</w:t>
+        <w:t xml:space="preserve">Función padre:</w:t>
       </w:r>
       <w:r>
         <w:t xml:space="preserve"> SOL-31</w:t>
@@ -10981,7 +11154,7 @@
         <w:pStyle w:val="Heading4"/>
       </w:pPr>
       <w:r>
-        <w:t xml:space="preserve">FE-10.4 — Monitorear el consumo y la cuota de API</w:t>
+        <w:t xml:space="preserve">FE-09.4 — Monitorear el consumo y la cuota de API</w:t>
       </w:r>
     </w:p>
     <w:p>
@@ -11114,7 +11287,7 @@
         <w:rPr>
           <w:b/>
         </w:rPr>
-        <w:t xml:space="preserve">Jira origen:</w:t>
+        <w:t xml:space="preserve">Función padre:</w:t>
       </w:r>
       <w:r>
         <w:t xml:space="preserve"> SOL-31</w:t>
@@ -11132,7 +11305,7 @@
         <w:pStyle w:val="Heading4"/>
       </w:pPr>
       <w:r>
-        <w:t xml:space="preserve">FE-10.5 — Cotizar y emitir de forma embebida por API</w:t>
+        <w:t xml:space="preserve">FE-09.5 — Cotizar y emitir de forma embebida por API</w:t>
       </w:r>
     </w:p>
     <w:p>
@@ -11265,7 +11438,7 @@
         <w:rPr>
           <w:b/>
         </w:rPr>
-        <w:t xml:space="preserve">Jira origen:</w:t>
+        <w:t xml:space="preserve">Función padre:</w:t>
       </w:r>
       <w:r>
         <w:t xml:space="preserve"> SOL-31</w:t>
@@ -13248,7 +13421,7 @@
               <w:spacing w:before="20" w:after="20"/>
             </w:pPr>
             <w:r>
-              <w:t xml:space="preserve">FE-05.2 Iniciar sesión con segundo factor</w:t>
+              <w:t xml:space="preserve">FE-10.2 Iniciar sesión con segundo factor</w:t>
             </w:r>
           </w:p>
         </w:tc>
@@ -13784,7 +13957,7 @@
               <w:spacing w:before="20" w:after="20"/>
             </w:pPr>
             <w:r>
-              <w:t xml:space="preserve">FE-06.1 Capturar el documento de identidad</w:t>
+              <w:t xml:space="preserve">FE-05.1 Capturar el documento de identidad</w:t>
             </w:r>
           </w:p>
         </w:tc>
@@ -13851,7 +14024,7 @@
               <w:spacing w:before="20" w:after="20"/>
             </w:pPr>
             <w:r>
-              <w:t xml:space="preserve">FE-06.2 Verificar identidad con prueba de vida</w:t>
+              <w:t xml:space="preserve">FE-05.2 Verificar identidad con prueba de vida</w:t>
             </w:r>
           </w:p>
         </w:tc>
@@ -13918,7 +14091,7 @@
               <w:spacing w:before="20" w:after="20"/>
             </w:pPr>
             <w:r>
-              <w:t xml:space="preserve">FE-07.1 Ver pólizas activas en la billetera</w:t>
+              <w:t xml:space="preserve">FE-06.1 Ver pólizas activas en la billetera</w:t>
             </w:r>
           </w:p>
         </w:tc>
@@ -13985,7 +14158,7 @@
               <w:spacing w:before="20" w:after="20"/>
             </w:pPr>
             <w:r>
-              <w:t xml:space="preserve">FE-07.2 Consultar las pólizas sin conexión</w:t>
+              <w:t xml:space="preserve">FE-06.2 Consultar las pólizas sin conexión</w:t>
             </w:r>
           </w:p>
         </w:tc>
@@ -14899,7 +15072,7 @@
               <w:spacing w:before="20" w:after="20"/>
             </w:pPr>
             <w:r>
-              <w:t xml:space="preserve">HU-ARQ-05, HU-ARQ-07, FE-05.2, FE-01.1</w:t>
+              <w:t xml:space="preserve">HU-ARQ-05, HU-ARQ-07, FE-10.2, FE-01.1</w:t>
             </w:r>
           </w:p>
         </w:tc>
@@ -15022,7 +15195,7 @@
               <w:spacing w:before="20" w:after="20"/>
             </w:pPr>
             <w:r>
-              <w:t xml:space="preserve">FE-02.1, FE-02.4, FE-02.5, FE-06.1, FE-06.2, FE-07.1, FE-07.2</w:t>
+              <w:t xml:space="preserve">FE-02.1, FE-02.4, FE-02.5, FE-05.1, FE-05.2, FE-06.1, FE-06.2</w:t>
             </w:r>
           </w:p>
         </w:tc>
@@ -15469,7 +15642,7 @@
               <w:spacing w:before="20" w:after="20"/>
             </w:pPr>
             <w:r>
-              <w:t xml:space="preserve">FE-01.1 Iniciar cotización · FE-10.3 Catálogo API</w:t>
+              <w:t xml:space="preserve">FE-01.1 Iniciar cotización · FE-09.3 Catálogo API</w:t>
             </w:r>
           </w:p>
         </w:tc>
@@ -15670,7 +15843,7 @@
               <w:spacing w:before="20" w:after="20"/>
             </w:pPr>
             <w:r>
-              <w:t xml:space="preserve">FE-07.2 Consultar pólizas sin conexión</w:t>
+              <w:t xml:space="preserve">FE-06.2 Consultar pólizas sin conexión</w:t>
             </w:r>
           </w:p>
         </w:tc>
@@ -15833,7 +16006,7 @@
         <w:pStyle w:val="Quote"/>
       </w:pPr>
       <w:r>
-        <w:t xml:space="preserve">ASR-3.3 se marca como parcial: la historia funcional que lo evidencia (FE-07.2) entra en el Proyecto Final 1, pero la historia de arquitectura que lo implementa por completo (HU-ARQ-10) se difiere. En el Proyecto Final 1 se demuestra la consulta sin conexión; la sincronización bidireccional completa queda para el Proyecto Final 2.</w:t>
+        <w:t xml:space="preserve">ASR-3.3 se marca como parcial: la historia funcional que lo evidencia (FE-06.2) entra en el Proyecto Final 1, pero la historia de arquitectura que lo implementa por completo (HU-ARQ-10) se difiere. En el Proyecto Final 1 se demuestra la consulta sin conexión; la sincronización bidireccional completa queda para el Proyecto Final 2.</w:t>
       </w:r>
     </w:p>
     <w:p>
@@ -15881,7 +16054,24 @@
               <w:rPr>
                 <w:b/>
               </w:rPr>
-              <w:t xml:space="preserve">Historia v1.1</w:t>
+              <w:t xml:space="preserve">Función en Jira</w:t>
+            </w:r>
+          </w:p>
+        </w:tc>
+        <w:tc>
+          <w:tcPr>
+            <w:tcW w:w="0" w:type="auto"/>
+            <w:shd w:val="clear" w:fill="EDF2F7"/>
+          </w:tcPr>
+          <w:p>
+            <w:pPr>
+              <w:spacing w:before="20" w:after="20"/>
+            </w:pPr>
+            <w:r>
+              <w:rPr>
+                <w:b/>
+              </w:rPr>
+              <w:t xml:space="preserve">Tipo en Jira</w:t>
             </w:r>
           </w:p>
         </w:tc>
@@ -15932,7 +16122,7 @@
               <w:rPr>
                 <w:b/>
               </w:rPr>
-              <w:t xml:space="preserve">Historias v2.0</w:t>
+              <w:t xml:space="preserve">Historias</w:t>
             </w:r>
           </w:p>
         </w:tc>
@@ -15964,7 +16154,20 @@
               <w:spacing w:before="20" w:after="20"/>
             </w:pPr>
             <w:r>
-              <w:t xml:space="preserve">SOL-3 Cotización de seguros en tiempo real</w:t>
+              <w:t xml:space="preserve">SOL-3 Cotización de seguros</w:t>
+            </w:r>
+          </w:p>
+        </w:tc>
+        <w:tc>
+          <w:tcPr>
+            <w:tcW w:w="0" w:type="auto"/>
+          </w:tcPr>
+          <w:p>
+            <w:pPr>
+              <w:spacing w:before="20" w:after="20"/>
+            </w:pPr>
+            <w:r>
+              <w:t xml:space="preserve">Función</w:t>
             </w:r>
           </w:p>
         </w:tc>
@@ -16044,6 +16247,19 @@
               <w:spacing w:before="20" w:after="20"/>
             </w:pPr>
             <w:r>
+              <w:t xml:space="preserve">Función</w:t>
+            </w:r>
+          </w:p>
+        </w:tc>
+        <w:tc>
+          <w:tcPr>
+            <w:tcW w:w="0" w:type="auto"/>
+          </w:tcPr>
+          <w:p>
+            <w:pPr>
+              <w:spacing w:before="20" w:after="20"/>
+            </w:pPr>
+            <w:r>
               <w:t xml:space="preserve">8</w:t>
             </w:r>
           </w:p>
@@ -16111,6 +16327,19 @@
               <w:spacing w:before="20" w:after="20"/>
             </w:pPr>
             <w:r>
+              <w:t xml:space="preserve">Función</w:t>
+            </w:r>
+          </w:p>
+        </w:tc>
+        <w:tc>
+          <w:tcPr>
+            <w:tcW w:w="0" w:type="auto"/>
+          </w:tcPr>
+          <w:p>
+            <w:pPr>
+              <w:spacing w:before="20" w:after="20"/>
+            </w:pPr>
+            <w:r>
               <w:t xml:space="preserve">5</w:t>
             </w:r>
           </w:p>
@@ -16178,6 +16407,19 @@
               <w:spacing w:before="20" w:after="20"/>
             </w:pPr>
             <w:r>
+              <w:t xml:space="preserve">Función</w:t>
+            </w:r>
+          </w:p>
+        </w:tc>
+        <w:tc>
+          <w:tcPr>
+            <w:tcW w:w="0" w:type="auto"/>
+          </w:tcPr>
+          <w:p>
+            <w:pPr>
+              <w:spacing w:before="20" w:after="20"/>
+            </w:pPr>
+            <w:r>
               <w:t xml:space="preserve">8</w:t>
             </w:r>
           </w:p>
@@ -16218,6 +16460,406 @@
             </w:pPr>
             <w:r>
               <w:t xml:space="preserve">15</w:t>
+            </w:r>
+          </w:p>
+        </w:tc>
+      </w:tr>
+      <w:tr>
+        <w:tc>
+          <w:tcPr>
+            <w:tcW w:w="0" w:type="auto"/>
+          </w:tcPr>
+          <w:p>
+            <w:pPr>
+              <w:spacing w:before="20" w:after="20"/>
+            </w:pPr>
+            <w:r>
+              <w:t xml:space="preserve">SOL-10 Autenticación biométrica y KYC/AML</w:t>
+            </w:r>
+          </w:p>
+        </w:tc>
+        <w:tc>
+          <w:tcPr>
+            <w:tcW w:w="0" w:type="auto"/>
+          </w:tcPr>
+          <w:p>
+            <w:pPr>
+              <w:spacing w:before="20" w:after="20"/>
+            </w:pPr>
+            <w:r>
+              <w:t xml:space="preserve">Función</w:t>
+            </w:r>
+          </w:p>
+        </w:tc>
+        <w:tc>
+          <w:tcPr>
+            <w:tcW w:w="0" w:type="auto"/>
+          </w:tcPr>
+          <w:p>
+            <w:pPr>
+              <w:spacing w:before="20" w:after="20"/>
+            </w:pPr>
+            <w:r>
+              <w:t xml:space="preserve">8</w:t>
+            </w:r>
+          </w:p>
+        </w:tc>
+        <w:tc>
+          <w:tcPr>
+            <w:tcW w:w="0" w:type="auto"/>
+          </w:tcPr>
+          <w:p>
+            <w:pPr>
+              <w:spacing w:before="20" w:after="20"/>
+            </w:pPr>
+            <w:r>
+              <w:t xml:space="preserve">FE-05.1 a FE-05.6</w:t>
+            </w:r>
+          </w:p>
+        </w:tc>
+        <w:tc>
+          <w:tcPr>
+            <w:tcW w:w="0" w:type="auto"/>
+          </w:tcPr>
+          <w:p>
+            <w:pPr>
+              <w:spacing w:before="20" w:after="20"/>
+            </w:pPr>
+            <w:r>
+              <w:t xml:space="preserve">6</w:t>
+            </w:r>
+          </w:p>
+        </w:tc>
+        <w:tc>
+          <w:tcPr>
+            <w:tcW w:w="0" w:type="auto"/>
+          </w:tcPr>
+          <w:p>
+            <w:pPr>
+              <w:spacing w:before="20" w:after="20"/>
+            </w:pPr>
+            <w:r>
+              <w:t xml:space="preserve">19</w:t>
+            </w:r>
+          </w:p>
+        </w:tc>
+      </w:tr>
+      <w:tr>
+        <w:tc>
+          <w:tcPr>
+            <w:tcW w:w="0" w:type="auto"/>
+          </w:tcPr>
+          <w:p>
+            <w:pPr>
+              <w:spacing w:before="20" w:after="20"/>
+            </w:pPr>
+            <w:r>
+              <w:t xml:space="preserve">SOL-11 Billetera de pólizas móvil</w:t>
+            </w:r>
+          </w:p>
+        </w:tc>
+        <w:tc>
+          <w:tcPr>
+            <w:tcW w:w="0" w:type="auto"/>
+          </w:tcPr>
+          <w:p>
+            <w:pPr>
+              <w:spacing w:before="20" w:after="20"/>
+            </w:pPr>
+            <w:r>
+              <w:t xml:space="preserve">Función</w:t>
+            </w:r>
+          </w:p>
+        </w:tc>
+        <w:tc>
+          <w:tcPr>
+            <w:tcW w:w="0" w:type="auto"/>
+          </w:tcPr>
+          <w:p>
+            <w:pPr>
+              <w:spacing w:before="20" w:after="20"/>
+            </w:pPr>
+            <w:r>
+              <w:t xml:space="preserve">5</w:t>
+            </w:r>
+          </w:p>
+        </w:tc>
+        <w:tc>
+          <w:tcPr>
+            <w:tcW w:w="0" w:type="auto"/>
+          </w:tcPr>
+          <w:p>
+            <w:pPr>
+              <w:spacing w:before="20" w:after="20"/>
+            </w:pPr>
+            <w:r>
+              <w:t xml:space="preserve">FE-06.1 a FE-06.5</w:t>
+            </w:r>
+          </w:p>
+        </w:tc>
+        <w:tc>
+          <w:tcPr>
+            <w:tcW w:w="0" w:type="auto"/>
+          </w:tcPr>
+          <w:p>
+            <w:pPr>
+              <w:spacing w:before="20" w:after="20"/>
+            </w:pPr>
+            <w:r>
+              <w:t xml:space="preserve">5</w:t>
+            </w:r>
+          </w:p>
+        </w:tc>
+        <w:tc>
+          <w:tcPr>
+            <w:tcW w:w="0" w:type="auto"/>
+          </w:tcPr>
+          <w:p>
+            <w:pPr>
+              <w:spacing w:before="20" w:after="20"/>
+            </w:pPr>
+            <w:r>
+              <w:t xml:space="preserve">12</w:t>
+            </w:r>
+          </w:p>
+        </w:tc>
+      </w:tr>
+      <w:tr>
+        <w:tc>
+          <w:tcPr>
+            <w:tcW w:w="0" w:type="auto"/>
+          </w:tcPr>
+          <w:p>
+            <w:pPr>
+              <w:spacing w:before="20" w:after="20"/>
+            </w:pPr>
+            <w:r>
+              <w:t xml:space="preserve">SOL-13 Notificaciones y asistencia</w:t>
+            </w:r>
+          </w:p>
+        </w:tc>
+        <w:tc>
+          <w:tcPr>
+            <w:tcW w:w="0" w:type="auto"/>
+          </w:tcPr>
+          <w:p>
+            <w:pPr>
+              <w:spacing w:before="20" w:after="20"/>
+            </w:pPr>
+            <w:r>
+              <w:t xml:space="preserve">Función</w:t>
+            </w:r>
+          </w:p>
+        </w:tc>
+        <w:tc>
+          <w:tcPr>
+            <w:tcW w:w="0" w:type="auto"/>
+          </w:tcPr>
+          <w:p>
+            <w:pPr>
+              <w:spacing w:before="20" w:after="20"/>
+            </w:pPr>
+            <w:r>
+              <w:t xml:space="preserve">5</w:t>
+            </w:r>
+          </w:p>
+        </w:tc>
+        <w:tc>
+          <w:tcPr>
+            <w:tcW w:w="0" w:type="auto"/>
+          </w:tcPr>
+          <w:p>
+            <w:pPr>
+              <w:spacing w:before="20" w:after="20"/>
+            </w:pPr>
+            <w:r>
+              <w:t xml:space="preserve">FE-07.1 a FE-07.4</w:t>
+            </w:r>
+          </w:p>
+        </w:tc>
+        <w:tc>
+          <w:tcPr>
+            <w:tcW w:w="0" w:type="auto"/>
+          </w:tcPr>
+          <w:p>
+            <w:pPr>
+              <w:spacing w:before="20" w:after="20"/>
+            </w:pPr>
+            <w:r>
+              <w:t xml:space="preserve">4</w:t>
+            </w:r>
+          </w:p>
+        </w:tc>
+        <w:tc>
+          <w:tcPr>
+            <w:tcW w:w="0" w:type="auto"/>
+          </w:tcPr>
+          <w:p>
+            <w:pPr>
+              <w:spacing w:before="20" w:after="20"/>
+            </w:pPr>
+            <w:r>
+              <w:t xml:space="preserve">10</w:t>
+            </w:r>
+          </w:p>
+        </w:tc>
+      </w:tr>
+      <w:tr>
+        <w:tc>
+          <w:tcPr>
+            <w:tcW w:w="0" w:type="auto"/>
+          </w:tcPr>
+          <w:p>
+            <w:pPr>
+              <w:spacing w:before="20" w:after="20"/>
+            </w:pPr>
+            <w:r>
+              <w:t xml:space="preserve">SOL-12 Reporte de siniestros con evidencia</w:t>
+            </w:r>
+          </w:p>
+        </w:tc>
+        <w:tc>
+          <w:tcPr>
+            <w:tcW w:w="0" w:type="auto"/>
+          </w:tcPr>
+          <w:p>
+            <w:pPr>
+              <w:spacing w:before="20" w:after="20"/>
+            </w:pPr>
+            <w:r>
+              <w:t xml:space="preserve">Función</w:t>
+            </w:r>
+          </w:p>
+        </w:tc>
+        <w:tc>
+          <w:tcPr>
+            <w:tcW w:w="0" w:type="auto"/>
+          </w:tcPr>
+          <w:p>
+            <w:pPr>
+              <w:spacing w:before="20" w:after="20"/>
+            </w:pPr>
+            <w:r>
+              <w:t xml:space="preserve">5</w:t>
+            </w:r>
+          </w:p>
+        </w:tc>
+        <w:tc>
+          <w:tcPr>
+            <w:tcW w:w="0" w:type="auto"/>
+          </w:tcPr>
+          <w:p>
+            <w:pPr>
+              <w:spacing w:before="20" w:after="20"/>
+            </w:pPr>
+            <w:r>
+              <w:t xml:space="preserve">FE-08.1 a FE-08.5</w:t>
+            </w:r>
+          </w:p>
+        </w:tc>
+        <w:tc>
+          <w:tcPr>
+            <w:tcW w:w="0" w:type="auto"/>
+          </w:tcPr>
+          <w:p>
+            <w:pPr>
+              <w:spacing w:before="20" w:after="20"/>
+            </w:pPr>
+            <w:r>
+              <w:t xml:space="preserve">5</w:t>
+            </w:r>
+          </w:p>
+        </w:tc>
+        <w:tc>
+          <w:tcPr>
+            <w:tcW w:w="0" w:type="auto"/>
+          </w:tcPr>
+          <w:p>
+            <w:pPr>
+              <w:spacing w:before="20" w:after="20"/>
+            </w:pPr>
+            <w:r>
+              <w:t xml:space="preserve">12</w:t>
+            </w:r>
+          </w:p>
+        </w:tc>
+      </w:tr>
+      <w:tr>
+        <w:tc>
+          <w:tcPr>
+            <w:tcW w:w="0" w:type="auto"/>
+          </w:tcPr>
+          <w:p>
+            <w:pPr>
+              <w:spacing w:before="20" w:after="20"/>
+            </w:pPr>
+            <w:r>
+              <w:t xml:space="preserve">SOL-31 Portal de socios distribuidores</w:t>
+            </w:r>
+          </w:p>
+        </w:tc>
+        <w:tc>
+          <w:tcPr>
+            <w:tcW w:w="0" w:type="auto"/>
+          </w:tcPr>
+          <w:p>
+            <w:pPr>
+              <w:spacing w:before="20" w:after="20"/>
+            </w:pPr>
+            <w:r>
+              <w:t xml:space="preserve">Historia ⚠</w:t>
+            </w:r>
+          </w:p>
+        </w:tc>
+        <w:tc>
+          <w:tcPr>
+            <w:tcW w:w="0" w:type="auto"/>
+          </w:tcPr>
+          <w:p>
+            <w:pPr>
+              <w:spacing w:before="20" w:after="20"/>
+            </w:pPr>
+            <w:r>
+              <w:t xml:space="preserve">8</w:t>
+            </w:r>
+          </w:p>
+        </w:tc>
+        <w:tc>
+          <w:tcPr>
+            <w:tcW w:w="0" w:type="auto"/>
+          </w:tcPr>
+          <w:p>
+            <w:pPr>
+              <w:spacing w:before="20" w:after="20"/>
+            </w:pPr>
+            <w:r>
+              <w:t xml:space="preserve">FE-09.1 a FE-09.5</w:t>
+            </w:r>
+          </w:p>
+        </w:tc>
+        <w:tc>
+          <w:tcPr>
+            <w:tcW w:w="0" w:type="auto"/>
+          </w:tcPr>
+          <w:p>
+            <w:pPr>
+              <w:spacing w:before="20" w:after="20"/>
+            </w:pPr>
+            <w:r>
+              <w:t xml:space="preserve">5</w:t>
+            </w:r>
+          </w:p>
+        </w:tc>
+        <w:tc>
+          <w:tcPr>
+            <w:tcW w:w="0" w:type="auto"/>
+          </w:tcPr>
+          <w:p>
+            <w:pPr>
+              <w:spacing w:before="20" w:after="20"/>
+            </w:pPr>
+            <w:r>
+              <w:t xml:space="preserve">16</w:t>
             </w:r>
           </w:p>
         </w:tc>
@@ -16237,6 +16879,9 @@
               </w:rPr>
               <w:t xml:space="preserve">(ausente en v1.1)</w:t>
             </w:r>
+            <w:r>
+              <w:t xml:space="preserve"> Autenticación web</w:t>
+            </w:r>
           </w:p>
         </w:tc>
         <w:tc>
@@ -16261,7 +16906,20 @@
               <w:spacing w:before="20" w:after="20"/>
             </w:pPr>
             <w:r>
-              <w:t xml:space="preserve">FE-05.1 a FE-05.4</w:t>
+              <w:t xml:space="preserve">—</w:t>
+            </w:r>
+          </w:p>
+        </w:tc>
+        <w:tc>
+          <w:tcPr>
+            <w:tcW w:w="0" w:type="auto"/>
+          </w:tcPr>
+          <w:p>
+            <w:pPr>
+              <w:spacing w:before="20" w:after="20"/>
+            </w:pPr>
+            <w:r>
+              <w:t xml:space="preserve">FE-10.1 a FE-10.4</w:t>
             </w:r>
           </w:p>
         </w:tc>
@@ -16302,342 +16960,20 @@
               <w:spacing w:before="20" w:after="20"/>
             </w:pPr>
             <w:r>
-              <w:t xml:space="preserve">SOL-10 Autenticación biométrica y KYC/AML</w:t>
-            </w:r>
-          </w:p>
-        </w:tc>
-        <w:tc>
-          <w:tcPr>
-            <w:tcW w:w="0" w:type="auto"/>
-          </w:tcPr>
-          <w:p>
-            <w:pPr>
-              <w:spacing w:before="20" w:after="20"/>
-            </w:pPr>
-            <w:r>
-              <w:t xml:space="preserve">8</w:t>
-            </w:r>
-          </w:p>
-        </w:tc>
-        <w:tc>
-          <w:tcPr>
-            <w:tcW w:w="0" w:type="auto"/>
-          </w:tcPr>
-          <w:p>
-            <w:pPr>
-              <w:spacing w:before="20" w:after="20"/>
-            </w:pPr>
-            <w:r>
-              <w:t xml:space="preserve">FE-06.1 a FE-06.6</w:t>
-            </w:r>
-          </w:p>
-        </w:tc>
-        <w:tc>
-          <w:tcPr>
-            <w:tcW w:w="0" w:type="auto"/>
-          </w:tcPr>
-          <w:p>
-            <w:pPr>
-              <w:spacing w:before="20" w:after="20"/>
-            </w:pPr>
-            <w:r>
-              <w:t xml:space="preserve">6</w:t>
-            </w:r>
-          </w:p>
-        </w:tc>
-        <w:tc>
-          <w:tcPr>
-            <w:tcW w:w="0" w:type="auto"/>
-          </w:tcPr>
-          <w:p>
-            <w:pPr>
-              <w:spacing w:before="20" w:after="20"/>
-            </w:pPr>
-            <w:r>
-              <w:t xml:space="preserve">19</w:t>
-            </w:r>
-          </w:p>
-        </w:tc>
-      </w:tr>
-      <w:tr>
-        <w:tc>
-          <w:tcPr>
-            <w:tcW w:w="0" w:type="auto"/>
-          </w:tcPr>
-          <w:p>
-            <w:pPr>
-              <w:spacing w:before="20" w:after="20"/>
-            </w:pPr>
-            <w:r>
-              <w:t xml:space="preserve">SOL-11 Billetera de pólizas móvil</w:t>
-            </w:r>
-          </w:p>
-        </w:tc>
-        <w:tc>
-          <w:tcPr>
-            <w:tcW w:w="0" w:type="auto"/>
-          </w:tcPr>
-          <w:p>
-            <w:pPr>
-              <w:spacing w:before="20" w:after="20"/>
-            </w:pPr>
-            <w:r>
-              <w:t xml:space="preserve">5</w:t>
-            </w:r>
-          </w:p>
-        </w:tc>
-        <w:tc>
-          <w:tcPr>
-            <w:tcW w:w="0" w:type="auto"/>
-          </w:tcPr>
-          <w:p>
-            <w:pPr>
-              <w:spacing w:before="20" w:after="20"/>
-            </w:pPr>
-            <w:r>
-              <w:t xml:space="preserve">FE-07.1 a FE-07.5</w:t>
-            </w:r>
-          </w:p>
-        </w:tc>
-        <w:tc>
-          <w:tcPr>
-            <w:tcW w:w="0" w:type="auto"/>
-          </w:tcPr>
-          <w:p>
-            <w:pPr>
-              <w:spacing w:before="20" w:after="20"/>
-            </w:pPr>
-            <w:r>
-              <w:t xml:space="preserve">5</w:t>
-            </w:r>
-          </w:p>
-        </w:tc>
-        <w:tc>
-          <w:tcPr>
-            <w:tcW w:w="0" w:type="auto"/>
-          </w:tcPr>
-          <w:p>
-            <w:pPr>
-              <w:spacing w:before="20" w:after="20"/>
-            </w:pPr>
-            <w:r>
-              <w:t xml:space="preserve">12</w:t>
-            </w:r>
-          </w:p>
-        </w:tc>
-      </w:tr>
-      <w:tr>
-        <w:tc>
-          <w:tcPr>
-            <w:tcW w:w="0" w:type="auto"/>
-          </w:tcPr>
-          <w:p>
-            <w:pPr>
-              <w:spacing w:before="20" w:after="20"/>
-            </w:pPr>
-            <w:r>
-              <w:t xml:space="preserve">SOL-12 Reporte de siniestros con evidencia</w:t>
-            </w:r>
-          </w:p>
-        </w:tc>
-        <w:tc>
-          <w:tcPr>
-            <w:tcW w:w="0" w:type="auto"/>
-          </w:tcPr>
-          <w:p>
-            <w:pPr>
-              <w:spacing w:before="20" w:after="20"/>
-            </w:pPr>
-            <w:r>
-              <w:t xml:space="preserve">5</w:t>
-            </w:r>
-          </w:p>
-        </w:tc>
-        <w:tc>
-          <w:tcPr>
-            <w:tcW w:w="0" w:type="auto"/>
-          </w:tcPr>
-          <w:p>
-            <w:pPr>
-              <w:spacing w:before="20" w:after="20"/>
-            </w:pPr>
-            <w:r>
-              <w:t xml:space="preserve">FE-08.1 a FE-08.5</w:t>
-            </w:r>
-          </w:p>
-        </w:tc>
-        <w:tc>
-          <w:tcPr>
-            <w:tcW w:w="0" w:type="auto"/>
-          </w:tcPr>
-          <w:p>
-            <w:pPr>
-              <w:spacing w:before="20" w:after="20"/>
-            </w:pPr>
-            <w:r>
-              <w:t xml:space="preserve">5</w:t>
-            </w:r>
-          </w:p>
-        </w:tc>
-        <w:tc>
-          <w:tcPr>
-            <w:tcW w:w="0" w:type="auto"/>
-          </w:tcPr>
-          <w:p>
-            <w:pPr>
-              <w:spacing w:before="20" w:after="20"/>
-            </w:pPr>
-            <w:r>
-              <w:t xml:space="preserve">12</w:t>
-            </w:r>
-          </w:p>
-        </w:tc>
-      </w:tr>
-      <w:tr>
-        <w:tc>
-          <w:tcPr>
-            <w:tcW w:w="0" w:type="auto"/>
-          </w:tcPr>
-          <w:p>
-            <w:pPr>
-              <w:spacing w:before="20" w:after="20"/>
-            </w:pPr>
-            <w:r>
-              <w:t xml:space="preserve">SOL-13 Notificaciones y asistencia</w:t>
-            </w:r>
-          </w:p>
-        </w:tc>
-        <w:tc>
-          <w:tcPr>
-            <w:tcW w:w="0" w:type="auto"/>
-          </w:tcPr>
-          <w:p>
-            <w:pPr>
-              <w:spacing w:before="20" w:after="20"/>
-            </w:pPr>
-            <w:r>
-              <w:t xml:space="preserve">5</w:t>
-            </w:r>
-          </w:p>
-        </w:tc>
-        <w:tc>
-          <w:tcPr>
-            <w:tcW w:w="0" w:type="auto"/>
-          </w:tcPr>
-          <w:p>
-            <w:pPr>
-              <w:spacing w:before="20" w:after="20"/>
-            </w:pPr>
-            <w:r>
-              <w:t xml:space="preserve">FE-09.1 a FE-09.4</w:t>
-            </w:r>
-          </w:p>
-        </w:tc>
-        <w:tc>
-          <w:tcPr>
-            <w:tcW w:w="0" w:type="auto"/>
-          </w:tcPr>
-          <w:p>
-            <w:pPr>
-              <w:spacing w:before="20" w:after="20"/>
-            </w:pPr>
-            <w:r>
-              <w:t xml:space="preserve">4</w:t>
-            </w:r>
-          </w:p>
-        </w:tc>
-        <w:tc>
-          <w:tcPr>
-            <w:tcW w:w="0" w:type="auto"/>
-          </w:tcPr>
-          <w:p>
-            <w:pPr>
-              <w:spacing w:before="20" w:after="20"/>
-            </w:pPr>
-            <w:r>
-              <w:t xml:space="preserve">10</w:t>
-            </w:r>
-          </w:p>
-        </w:tc>
-      </w:tr>
-      <w:tr>
-        <w:tc>
-          <w:tcPr>
-            <w:tcW w:w="0" w:type="auto"/>
-          </w:tcPr>
-          <w:p>
-            <w:pPr>
-              <w:spacing w:before="20" w:after="20"/>
-            </w:pPr>
-            <w:r>
-              <w:t xml:space="preserve">SOL-31 Portal de socios distribuidores</w:t>
-            </w:r>
-          </w:p>
-        </w:tc>
-        <w:tc>
-          <w:tcPr>
-            <w:tcW w:w="0" w:type="auto"/>
-          </w:tcPr>
-          <w:p>
-            <w:pPr>
-              <w:spacing w:before="20" w:after="20"/>
-            </w:pPr>
-            <w:r>
-              <w:t xml:space="preserve">8</w:t>
-            </w:r>
-          </w:p>
-        </w:tc>
-        <w:tc>
-          <w:tcPr>
-            <w:tcW w:w="0" w:type="auto"/>
-          </w:tcPr>
-          <w:p>
-            <w:pPr>
-              <w:spacing w:before="20" w:after="20"/>
-            </w:pPr>
-            <w:r>
-              <w:t xml:space="preserve">FE-10.1 a FE-10.5</w:t>
-            </w:r>
-          </w:p>
-        </w:tc>
-        <w:tc>
-          <w:tcPr>
-            <w:tcW w:w="0" w:type="auto"/>
-          </w:tcPr>
-          <w:p>
-            <w:pPr>
-              <w:spacing w:before="20" w:after="20"/>
-            </w:pPr>
-            <w:r>
-              <w:t xml:space="preserve">5</w:t>
-            </w:r>
-          </w:p>
-        </w:tc>
-        <w:tc>
-          <w:tcPr>
-            <w:tcW w:w="0" w:type="auto"/>
-          </w:tcPr>
-          <w:p>
-            <w:pPr>
-              <w:spacing w:before="20" w:after="20"/>
-            </w:pPr>
-            <w:r>
-              <w:t xml:space="preserve">16</w:t>
-            </w:r>
-          </w:p>
-        </w:tc>
-      </w:tr>
-      <w:tr>
-        <w:tc>
-          <w:tcPr>
-            <w:tcW w:w="0" w:type="auto"/>
-          </w:tcPr>
-          <w:p>
-            <w:pPr>
-              <w:spacing w:before="20" w:after="20"/>
-            </w:pPr>
-            <w:r>
-              <w:t xml:space="preserve">HU-ARQ-01 a HU-ARQ-11</w:t>
+              <w:t xml:space="preserve">SOL-20 a SOL-45 · HU-ARQ-01 a HU-ARQ-11</w:t>
+            </w:r>
+          </w:p>
+        </w:tc>
+        <w:tc>
+          <w:tcPr>
+            <w:tcW w:w="0" w:type="auto"/>
+          </w:tcPr>
+          <w:p>
+            <w:pPr>
+              <w:spacing w:before="20" w:after="20"/>
+            </w:pPr>
+            <w:r>
+              <w:t xml:space="preserve">Historia</w:t>
             </w:r>
           </w:p>
         </w:tc>
@@ -16666,7 +17002,7 @@
               <w:rPr>
                 <w:i/>
               </w:rPr>
-              <w:t xml:space="preserve">(sin cambio)</w:t>
+              <w:t xml:space="preserve">(sin descomponer)</w:t>
             </w:r>
           </w:p>
         </w:tc>
@@ -16723,6 +17059,19 @@
               <w:spacing w:before="20" w:after="20"/>
             </w:pPr>
             <w:r>
+              <w:t/>
+            </w:r>
+          </w:p>
+        </w:tc>
+        <w:tc>
+          <w:tcPr>
+            <w:tcW w:w="0" w:type="auto"/>
+          </w:tcPr>
+          <w:p>
+            <w:pPr>
+              <w:spacing w:before="20" w:after="20"/>
+            </w:pPr>
+            <w:r>
               <w:rPr>
                 <w:b/>
               </w:rPr>
@@ -16780,6 +17129,23 @@
     <w:p>
       <w:r>
         <w:t/>
+      </w:r>
+    </w:p>
+    <w:p>
+      <w:pPr>
+        <w:pStyle w:val="Quote"/>
+      </w:pPr>
+      <w:r>
+        <w:t xml:space="preserve">⚠ </w:t>
+      </w:r>
+      <w:r>
+        <w:rPr>
+          <w:b/>
+        </w:rPr>
+        <w:t xml:space="preserve">SOL-31 está tipada como Historia cuando debería ser Función</w:t>
+      </w:r>
+      <w:r>
+        <w:t xml:space="preserve">, igual que sus ocho hermanas FE-01 a FE-08. Es la única funcionalidad de cara al usuario que cuelga directamente de su épica sin nivel de función intermedio. Se corrige junto con la carga de las historias nuevas.</w:t>
       </w:r>
     </w:p>
     <w:p>

</xml_diff>

<commit_message>
Agrega portada institucional a los entregables
Los dos documentos abren ahora con una pagina de portada formal
(universidad, facultad, programa, curso, titulo, proyecto, entrega,
grupo, tabla de integrantes con su rol y fecha) seguida de un salto
de pagina, en lugar del bloque de titulo simple que tenian.

La portada se declara como un bloque de metadatos al inicio del
markdown, de modo que cualquier entregable futuro la obtiene
escribiendo solo sus campos.
</commit_message>
<xml_diff>
--- a/documentos/semana-4/historias_de_usuario_v2.docx
+++ b/documentos/semana-4/historias_de_usuario_v2.docx
@@ -4,34 +4,154 @@
   <w:body>
     <w:p>
       <w:pPr>
-        <w:pStyle w:val="Heading1"/>
-      </w:pPr>
-      <w:r>
-        <w:t xml:space="preserve">Historias de Usuario y Capacidad del Equipo — Solventa</w:t>
-      </w:r>
-    </w:p>
-    <w:p>
-      <w:r>
-        <w:rPr>
-          <w:b/>
-        </w:rPr>
-        <w:t xml:space="preserve">Universidad de los Andes · Maestría en Ingeniería de Software · MISW4501</w:t>
-      </w:r>
-    </w:p>
-    <w:p>
-      <w:r>
-        <w:rPr>
-          <w:b/>
-        </w:rPr>
-        <w:t xml:space="preserve">Proyecto Integrador — Grupo 2</w:t>
-      </w:r>
-    </w:p>
-    <w:p>
-      <w:r>
-        <w:rPr>
-          <w:b/>
-        </w:rPr>
-        <w:t xml:space="preserve">Versión 2.0 · 30 de agosto de 2026</w:t>
+        <w:jc w:val="center"/>
+        <w:spacing w:before="600" w:after="80"/>
+      </w:pPr>
+      <w:r>
+        <w:rPr>
+          <w:sz w:val="20"/>
+          <w:color w:val="000000"/>
+        </w:rPr>
+        <w:t xml:space="preserve"/>
+      </w:r>
+    </w:p>
+    <w:p>
+      <w:pPr>
+        <w:jc w:val="center"/>
+        <w:spacing w:before="0" w:after="60"/>
+      </w:pPr>
+      <w:r>
+        <w:rPr>
+          <w:b/>
+          <w:sz w:val="30"/>
+          <w:color w:val="1A3A5C"/>
+        </w:rPr>
+        <w:t xml:space="preserve">Universidad de los Andes</w:t>
+      </w:r>
+    </w:p>
+    <w:p>
+      <w:pPr>
+        <w:jc w:val="center"/>
+        <w:spacing w:before="0" w:after="40"/>
+      </w:pPr>
+      <w:r>
+        <w:rPr>
+          <w:sz w:val="19"/>
+          <w:color w:val="44607A"/>
+        </w:rPr>
+        <w:t xml:space="preserve">Facultad de Ingeniería · Departamento de Ingeniería de Sistemas y Computación</w:t>
+      </w:r>
+    </w:p>
+    <w:p>
+      <w:pPr>
+        <w:jc w:val="center"/>
+        <w:spacing w:before="0" w:after="40"/>
+      </w:pPr>
+      <w:r>
+        <w:rPr>
+          <w:b/>
+          <w:sz w:val="21"/>
+          <w:color w:val="44607A"/>
+        </w:rPr>
+        <w:t xml:space="preserve">Maestría en Ingeniería de Software</w:t>
+      </w:r>
+    </w:p>
+    <w:p>
+      <w:pPr>
+        <w:jc w:val="center"/>
+        <w:spacing w:before="0" w:after="40"/>
+      </w:pPr>
+      <w:r>
+        <w:rPr>
+          <w:sz w:val="19"/>
+          <w:color w:val="44607A"/>
+        </w:rPr>
+        <w:t xml:space="preserve">MISW4501 — Proyecto Final</w:t>
+      </w:r>
+    </w:p>
+    <w:p>
+      <w:pPr>
+        <w:jc w:val="center"/>
+        <w:spacing w:before="360" w:after="360"/>
+        <w:pBdr>
+          <w:bottom w:val="single" w:sz="12" w:space="1" w:color="9CC3E5"/>
+        </w:pBdr>
+      </w:pPr>
+    </w:p>
+    <w:p>
+      <w:pPr>
+        <w:jc w:val="center"/>
+        <w:spacing w:before="0" w:after="100"/>
+      </w:pPr>
+      <w:r>
+        <w:rPr>
+          <w:b/>
+          <w:sz w:val="52"/>
+          <w:color w:val="1A3A5C"/>
+        </w:rPr>
+        <w:t xml:space="preserve">Historias de Usuario</w:t>
+      </w:r>
+    </w:p>
+    <w:p>
+      <w:pPr>
+        <w:jc w:val="center"/>
+        <w:spacing w:before="0" w:after="60"/>
+      </w:pPr>
+      <w:r>
+        <w:rPr>
+          <w:sz w:val="30"/>
+          <w:color w:val="2E6DA4"/>
+        </w:rPr>
+        <w:t xml:space="preserve">Backlog completo, capacidad del equipo y alcance del proyecto</w:t>
+      </w:r>
+    </w:p>
+    <w:p>
+      <w:pPr>
+        <w:jc w:val="center"/>
+        <w:spacing w:before="0" w:after="40"/>
+      </w:pPr>
+      <w:r>
+        <w:rPr>
+          <w:sz w:val="24"/>
+          <w:color w:val="555555"/>
+        </w:rPr>
+        <w:t xml:space="preserve">Proyecto Solventa — Aseguradora digital sobre Finanzas Abiertas</w:t>
+      </w:r>
+    </w:p>
+    <w:p>
+      <w:pPr>
+        <w:jc w:val="center"/>
+        <w:spacing w:before="360" w:after="360"/>
+        <w:pBdr>
+          <w:bottom w:val="single" w:sz="12" w:space="1" w:color="9CC3E5"/>
+        </w:pBdr>
+      </w:pPr>
+    </w:p>
+    <w:p>
+      <w:pPr>
+        <w:jc w:val="center"/>
+        <w:spacing w:before="0" w:after="40"/>
+      </w:pPr>
+      <w:r>
+        <w:rPr>
+          <w:b/>
+          <w:sz w:val="26"/>
+          <w:color w:val="1A3A5C"/>
+        </w:rPr>
+        <w:t xml:space="preserve">Corrección de la entrega — Semana 3  ·  Versión 2.0</w:t>
+      </w:r>
+    </w:p>
+    <w:p>
+      <w:pPr>
+        <w:jc w:val="center"/>
+        <w:spacing w:before="0" w:after="200"/>
+      </w:pPr>
+      <w:r>
+        <w:rPr>
+          <w:sz w:val="22"/>
+          <w:color w:val="444444"/>
+        </w:rPr>
+        <w:t xml:space="preserve">Grupo 2</w:t>
       </w:r>
     </w:p>
     <w:tbl>
@@ -109,7 +229,7 @@
               <w:spacing w:before="20" w:after="20"/>
             </w:pPr>
             <w:r>
-              <w:t xml:space="preserve">Gerente — Usabilidad y entrega</w:t>
+              <w:t xml:space="preserve">Gerente del proyecto — Usabilidad y entrega</w:t>
             </w:r>
           </w:p>
         </w:tc>
@@ -137,7 +257,7 @@
               <w:spacing w:before="20" w:after="20"/>
             </w:pPr>
             <w:r>
-              <w:t xml:space="preserve">Web front, integración API, pagos</w:t>
+              <w:t xml:space="preserve">Web front, integración de APIs y pagos</w:t>
             </w:r>
           </w:p>
         </w:tc>
@@ -165,7 +285,7 @@
               <w:spacing w:before="20" w:after="20"/>
             </w:pPr>
             <w:r>
-              <w:t xml:space="preserve">Arquitectura, Open Finance, KYC, rendimiento, seguridad</w:t>
+              <w:t xml:space="preserve">Arquitectura, Open Finance, KYC, rendimiento y seguridad</w:t>
             </w:r>
           </w:p>
         </w:tc>
@@ -193,7 +313,7 @@
               <w:spacing w:before="20" w:after="20"/>
             </w:pPr>
             <w:r>
-              <w:t xml:space="preserve">Dominio, web back, móvil, pruebas unitarias</w:t>
+              <w:t xml:space="preserve">Dominio, web back, móvil y pruebas unitarias</w:t>
             </w:r>
           </w:p>
         </w:tc>
@@ -206,10 +326,22 @@
     </w:p>
     <w:p>
       <w:pPr>
-        <w:pBdr>
-          <w:bottom w:val="single" w:sz="6" w:space="1" w:color="D0D0D0"/>
-        </w:pBdr>
-      </w:pPr>
+        <w:jc w:val="center"/>
+        <w:spacing w:before="300" w:after="80"/>
+      </w:pPr>
+      <w:r>
+        <w:rPr>
+          <w:i/>
+          <w:sz w:val="20"/>
+          <w:color w:val="666666"/>
+        </w:rPr>
+        <w:t xml:space="preserve">Bogotá D.C. · 30 de agosto de 2026</w:t>
+      </w:r>
+    </w:p>
+    <w:p>
+      <w:r>
+        <w:br w:type="page"/>
+      </w:r>
     </w:p>
     <w:p>
       <w:pPr>

</xml_diff>